<commit_message>
Proofcheck Inn Trouble Greek: MINOR (26 fixes)
Co-Authored-By: Claude Opus 5.5 <noreply@anthropic.com>
Claude-Session: https://claude.ai/code/session_012Cm8JxdqzjuttdUSdkQCUg
</commit_message>
<xml_diff>
--- a/translated/corrected/Inn Trouble - ASSEMBLED - FORMATTED_Greek.docx
+++ b/translated/corrected/Inn Trouble - ASSEMBLED - FORMATTED_Greek.docx
@@ -624,7 +624,7 @@
     <w:p/>
     <w:p>
       <w:r>
-        <w:t xml:space="preserve">Κοίταξα. Η φωτογραφία έδειχνε μια γυναίκα με ρούχα από πριν από εκατό χρόνια, λεπτή και σοβαρή, με τα σκούρα μαλλιά της κυματιστά κοντά στο κεφάλι της στο στυλ της δεκαετίας του '20, το πηγούνι της ψηλά, τα μάτια της να συναντούν την κάμερα κατάματα με κάτι μέσα τους που δεν ήταν ακριβώς χαμόγελο και δεν ήταν ακριβώς περιφρόνηση αλλά ήταν κοντινός συγγενής και των δύο. Φορούσε ένα φόρεμα με ψηλό γιακά, και στον λαιμό της, καρφιτσωμένη ακριβώς κάτω από τον γιακά, ήταν μια καρφίτσα. Ακόμη και στην απαλή καφέ εικόνα μπορούσες να δεις ότι ήταν ένα εξαιρετικό κομμάτι, χρυσός δουλεμένος σε περίπλοκο δέσιμο γύρω από μια μοναδική μεγάλη πέτρα που το παλιό φιλμ είχε αποτυπώσει ως μια χλωμή γκρι λάμψη.</w:t>
+        <w:t xml:space="preserve">Κοίταξα. Η φωτογραφία έδειχνε μια γυναίκα με ρούχα από πριν από εκατό χρόνια, λεπτή και σοβαρή, με τα σκούρα μαλλιά της κυματιστά κοντά στο κεφάλι της στο στυλ της δεκαετίας του '20, το πηγούνι της ψηλά, τα μάτια της να συναντούν την κάμερα κατάματα με κάτι μέσα τους που δεν ήταν ακριβώς χαμόγελο και δεν ήταν ακριβώς αψηφισιά αλλά ήταν κοντινός συγγενής και των δύο. Φορούσε ένα φόρεμα με ψηλό γιακά, και στον λαιμό της, καρφιτσωμένη ακριβώς κάτω από τον γιακά, ήταν μια καρφίτσα. Ακόμη και στην απαλή καφέ εικόνα μπορούσες να δεις ότι ήταν ένα εξαιρετικό κομμάτι, χρυσός δουλεμένος σε περίπλοκο δέσιμο γύρω από μια μοναδική μεγάλη πέτρα που το παλιό φιλμ είχε αποτυπώσει ως μια χλωμή γκρι λάμψη.</w:t>
       </w:r>
     </w:p>
     <w:p/>
@@ -636,7 +636,7 @@
     <w:p/>
     <w:p>
       <w:r>
-        <w:t xml:space="preserve">«Όχι». Η φωνή της Φιόνας έσπασε. «Όχι, αυτή είναι μια Μπλάκμπερν. Μία από τις παλιές Μπλάκμπερν, τότε που είχαν όλα τα χρήματα στην κομητεία. Δεν ξέρω καν το όνομά της». Άγγιξε την καφέ άκρη της φωτογραφίας. «Η Κόνστανς την κράτησε όλα αυτά τα χρόνια. Νομίζω ότι ήταν η καρφίτσα που δεν μπορούσε να αφήσει να φύγει, όχι η γυναίκα. Αλλά η καρφίτσα που φοράει». Πίεσε το χέρι της επίπεδο στο στήθος της, σαν να την πονούσε εκεί. «Η καρφίτσα είναι δική μας, Τζέσικα. Αυτό κρατάνε εναντίον μου. Αυτή η καρφίτσα».</w:t>
+        <w:t xml:space="preserve">«Όχι». Η φωνή της Φιόνας έσπασε. «Όχι, αυτή είναι μια Μπλάκμπερν. Μία από τους παλιούς Μπλάκμπερν, τότε που είχαν όλα τα χρήματα στην κομητεία. Δεν ξέρω καν το όνομά της». Άγγιξε την καφέ άκρη της φωτογραφίας. «Η Κόνστανς την κράτησε όλα αυτά τα χρόνια. Νομίζω ότι ήταν η καρφίτσα που δεν μπορούσε να αφήσει να φύγει, όχι η γυναίκα. Αλλά η καρφίτσα που φοράει». Πίεσε το χέρι της επίπεδο στο στήθος της, σαν να την πονούσε εκεί. «Η καρφίτσα είναι δική μας, Τζέσικα. Αυτό κρατάνε εναντίον μου. Αυτή η καρφίτσα».</w:t>
       </w:r>
     </w:p>
     <w:p/>
@@ -711,7 +711,7 @@
     <w:p/>
     <w:p>
       <w:r>
-        <w:t>Ξανασήκωσα το σημείωμα και το διάβασα ξανά, πιο προσεκτικά αυτή τη φορά, και καθώς το έφερα κοντά για να διαβάσω το στριμωγμένο σκάλισμα, μια μυρωδιά αναδύθηκε από το χαρτί. Αμυδρή, αλλά εκεί. Κοφτερή, λίγο μεταλλική, με κάτι ορυκτό κάτω από αυτήν. Το ήξερα από κάποιο πρόσφατο μέρος και δεν μπορούσα, για χάρη της ζωής μου, να πιάσω πού.</w:t>
+        <w:t xml:space="preserve">Ξανασήκωσα το σημείωμα και το διάβασα ξανά, πιο προσεκτικά αυτή τη φορά, και καθώς το έφερα κοντά για να διαβάσω το στριμωγμένο σκάλισμα, μια μυρωδιά αναδύθηκε από το χαρτί. Αμυδρή, αλλά εκεί. Κοφτερή, λίγο μεταλλική, με κάτι ορυκτό κάτω από αυτήν. Το ήξερα από κάποιο πρόσφατο μέρος και δεν μπορούσα, όσο κι αν προσπαθούσα, να θυμηθώ πού.</w:t>
       </w:r>
     </w:p>
     <w:p/>
@@ -753,7 +753,7 @@
     <w:p/>
     <w:p>
       <w:r>
-        <w:t xml:space="preserve">«Δεν σου ζητώ να πιστέψεις τίποτα για κανέναν ακόμα», είπα απαλά. «Σου ζητώ μόνο από πού θα μπορούσε να προέλθει η γνώση. Και υπάρχουν δύο μέρη, και το ένα από αυτά είναι ένα μπαούλο που μόνο εσύ μπορείς να ανοίξεις. Αυτό δεν είναι κατηγορία». Δίπλωσα το σημείωμα κατά μήκος των φθαρμένων τσακίσεών του, προσεκτικά, και την κοίταξα. «Μπορώ να τα κρατήσω αυτά; Και το σημείωμα και τη φωτογραφία. Το σημείωμα μπορεί να μας πει περισσότερα απ' όσα εννοούσε ο συγγραφέας του».</w:t>
+        <w:t xml:space="preserve">«Δεν σου ζητώ να πιστέψεις τίποτα για κανέναν ακόμα», είπα απαλά. «Ρωτάω μόνο από πού θα μπορούσε να προέλθει η γνώση. Και υπάρχουν δύο μέρη, και το ένα από αυτά είναι ένα μπαούλο που μόνο εσύ μπορείς να ανοίξεις. Αυτό δεν είναι κατηγορία». Δίπλωσα το σημείωμα κατά μήκος των φθαρμένων τσακίσεών του, προσεκτικά, και την κοίταξα. «Μπορώ να τα κρατήσω αυτά; Και το σημείωμα και τη φωτογραφία. Το σημείωμα μπορεί να μας πει περισσότερα απ' όσα εννοούσε ο συγγραφέας του».</w:t>
       </w:r>
     </w:p>
     <w:p/>
@@ -783,7 +783,7 @@
     <w:p/>
     <w:p>
       <w:r>
-        <w:t xml:space="preserve">«Θα το βρούμε αυτό», είπα, και το εννοούσα μέχρι τα βάθη της γης. Έχωσα το σημείωμα και τη φωτογραφία προσεκτικά στην εσωτερική τσέπη του παλτό μου, πάνω από την καρδιά μου. «Με ακούς; Δεν το κουβαλάς αυτό μόνη σου πια. Ούτε για μια μέρα ακόμα. Όσο κι αν κοστίσει, όποιος κι αν αποδειχθεί ότι είναι, έχεις μια φίλη μέσα σε αυτό τώρα, και εγώ είμαι πολύ πεισματάρα, και έχω περισσότερο χρόνο και υπομονή από οποιονδήποτε ξέρεις».</w:t>
+        <w:t xml:space="preserve">«Θα το βρούμε αυτό», είπα, και το εννοούσα απόλυτα. Έχωσα το σημείωμα και τη φωτογραφία προσεκτικά στην εσωτερική τσέπη του παλτό μου, πάνω από την καρδιά μου. «Με ακούς; Δεν το κουβαλάς αυτό μόνη σου πια. Ούτε για μια μέρα ακόμα. Όσο κι αν κοστίσει, όποιος κι αν αποδειχθεί ότι είναι, έχεις μια φίλη μέσα σε αυτό τώρα, και εγώ είμαι πολύ πεισματάρα, και έχω περισσότερο χρόνο και υπομονή από οποιονδήποτε ξέρεις».</w:t>
       </w:r>
     </w:p>
     <w:p/>
@@ -824,7 +824,7 @@
     <w:p/>
     <w:p>
       <w:r>
-        <w:t xml:space="preserve">Ο Νικ είχε ετοιμάσει σούπα όταν γύρισα σπίτι, κάτι που συνήθιζε να κάνει όταν τα πράγματα ζόριζαν. Άλλοι άντρες έκαναν βόλτες πάνω-κάτω, ή γυάλιζαν διάφορα αντικείμενα, ή σώπαιναν κι έκοβαν ξύλα. Ο άντρας μου έφτιαχνε σούπα. Έλεγε πως ένα πρόβλημα φαινόταν μικρότερο πίσω από ένα γεμάτο πιάτο, και στα τόσα χρόνια γάμου μας δεν τον είχα δει ποτέ να κάνει λάθος σε αυτό.</w:t>
+        <w:t xml:space="preserve">Ο Νικ είχε ετοιμάσει σούπα όταν γύρισα σπίτι, κάτι που συνήθιζε να κάνει όταν τα πράγματα ζόριζαν. Άλλοι άντρες έκαναν βόλτες πάνω-κάτω, ή γυάλιζαν διάφορα αντικείμενα, ή σώπαιναν κι έκοβαν ξύλα. Ο άντρας μου έφτιαχνε σούπα. Έλεγε πως ένα πρόβλημα φαινόταν μικρότερο πίσω από ένα γεμάτο πιάτο, και σε αρκετούς αιώνες γάμου δεν τον είχα δει ποτέ να κάνει λάθος σε αυτό.</w:t>
       </w:r>
     </w:p>
     <w:p/>
@@ -1034,7 +1034,7 @@
     <w:p/>
     <w:p>
       <w:r>
-        <w:t>Έμεινε σιωπηλός για μια στιγμή, οι δυο μας αναπνοές θολώνοντας το κρύο γυαλί. «Τα πάντα έχουν σχέση με τα πάντα, αυτή την εποχή του χρόνου», είπε, το οποίο ήταν αυτό που έλεγε ο Νικ όταν η αληθινή απάντηση ήταν ναι και δεν ήταν έτοιμος να την πει φωναχτά. Τύλιξε τα χέρια του γύρω μου από πίσω. «Δεν πρόκειται να βλάψει κανέναν, Τζες. Ό,τι κι αν κάνει εκεί έξω με τα φώτα. Δεν ξέρει πώς να βλάψει κανέναν. Ποτέ δεν ήξερε. Απλώς ψάχνει κάτι».</w:t>
+        <w:t xml:space="preserve">Έμεινε σιωπηλός για μια στιγμή, με τις ανάσες μας να θολώνουν το κρύο γυαλί. «Τα πάντα έχουν σχέση με τα πάντα, αυτή την εποχή του χρόνου», είπε, το οποίο ήταν αυτό που έλεγε ο Νικ όταν η αληθινή απάντηση ήταν ναι και δεν ήταν έτοιμος να την πει φωναχτά. Τύλιξε τα χέρια του γύρω μου από πίσω. «Δεν πρόκειται να βλάψει κανέναν, Τζες. Ό,τι κι αν κάνει εκεί έξω με τα φώτα. Δεν ξέρει πώς να βλάψει κανέναν. Ποτέ δεν ήξερε. Απλώς ψάχνει κάτι».</w:t>
       </w:r>
     </w:p>
     <w:p/>
@@ -1058,7 +1058,7 @@
     <w:p/>
     <w:p>
       <w:r>
-        <w:t xml:space="preserve">Σταθήκαμε εκεί για λίγο ακόμη, κοιτάζοντας τη χρυσή πόλη, και μετά ανεβήκαμε στο κρεβάτι. Ξάπλωσα ξύπνια για αρκετή ώρα στο σκοτάδι, κρατώντας δύο πράγματα ταυτόχρονα. Κάπου κάτω στο Φροστ Φολς ένα άτομο είχε σταθεί ανάμεσα στα κουτιά των Μπλάκμπερν και είχε βρει έναν τρόπο να κλείσει το χέρι του γύρω από το λαιμό μιας καλής γυναίκας για μισό εκατομμύριο δολάρια. Και πέρα από το λιβάδι ο σύζυγός μου έχτιζε μια έκπληξη που δεν ήθελε να ονομάσει, ενώ τα φώτα μετατρέπονταν μόνα τους σε χρυσά και η μαγεία που είχαμε φέρει μαζί μας πήγαινε να κυνηγήσει μέσα στο σκοτάδι ένα μέρος για να προσγειωθεί.</w:t>
+        <w:t xml:space="preserve">Σταθήκαμε εκεί για λίγο ακόμη, κοιτάζοντας τη χρυσή πόλη, και μετά ανεβήκαμε για ύπνο. Ξάπλωσα ξύπνια για αρκετή ώρα στο σκοτάδι, κρατώντας δύο πράγματα ταυτόχρονα. Κάπου κάτω στο Φροστ Φολς ένα άτομο είχε σταθεί ανάμεσα στα κουτιά των Μπλάκμπερν και είχε βρει έναν τρόπο να κλείσει το χέρι του γύρω από το λαιμό μιας καλής γυναίκας για μισό εκατομμύριο δολάρια. Και πέρα από το λιβάδι ο σύζυγός μου έχτιζε μια έκπληξη που δεν ήθελε να ονομάσει, ενώ τα φώτα μετατρέπονταν μόνα τους σε χρυσά και η μαγεία που είχαμε φέρει μαζί μας πήγαινε να κυνηγήσει μέσα στο σκοτάδι ένα μέρος για να προσγειωθεί.</w:t>
       </w:r>
     </w:p>
     <w:p/>
@@ -1182,7 +1182,7 @@
     <w:p/>
     <w:p>
       <w:r>
-        <w:t xml:space="preserve">«Πάντα κυνηγάω την καρφίτσα μου. Είναι η δουλειά μου». Ισιώθηκε και έχωσε το σημειωματάριο κάτω από τη μασχάλη του. «Ένας τύπος με πλησίασε μόλις τώρα στο τραπέζι με τον χυμό μήλου και μου είπε ότι οι Μπλάκμπερν κάποτε κατείχαν τη μισή Οδό Μέιπλ. Το ξέρατε αυτό; Στον κόσμο αρέσει να σου λέει τι είχαν οι πλούσιες οικογένειες. Ποτέ δεν μπορούν να σου πουν τι έκαναν οι πλούσιες οικογένειες στους ανθρώπους που δούλευαν γι' αυτές. Αυτό το κομμάτι δεν μπαίνει στα οικογενειακά αρχεία». Ένευσε προς τη βιτρίνα. «Παράξενο, ε; Είκοσι χρόνια επιστολές και ούτε μία γραμμένη από υπηρέτρια».</w:t>
+        <w:t xml:space="preserve">«Πάντα κυνηγάω την καρφίτσα μου. Είναι η δουλειά μου». Ισιώθηκε και έχωσε το σημειωματάριο κάτω από τη μασχάλη του. «Ένας τύπος με πλησίασε μόλις τώρα στο τραπέζι με τον χυμό μήλου και μου είπε ότι οι Μπλάκμπερν κάποτε κατείχαν τη μισή Οδό Μέιπλ. Το ξέρατε αυτό; Στον κόσμο αρέσει να σου λέει τι είχαν οι πλούσιες οικογένειες. Ποτέ δεν μπορούν να σου πουν τι έκαναν οι πλούσιες οικογένειες στους ανθρώπους που δούλευαν γι' αυτές. Αυτό το κομμάτι δεν μπαίνει στα οικογενειακά αρχεία». Ένευσε προς τη βιτρίνα. «Παράξενο, ε; Είκοσι χρόνια γράμματα και ούτε ένα γραμμένο από υπηρέτρια».</w:t>
       </w:r>
     </w:p>
     <w:p/>
@@ -1546,13 +1546,13 @@
     <w:p/>
     <w:p>
       <w:r>
-        <w:t xml:space="preserve">Το γέλιο της βγήκε φωτεινό και ξαφνικό, ένα αληθινό γέλιο, από εκείνα που ξεφεύγουν από ένα παιδί πριν αποφασίσει αν θα το αφήσει, και μου έκανε περισσότερο καλό από μια ολόκληρη εβδομάδα ύπνου, επειδή είχε περάσει ένα μεγάλο διάστημα, μετά τον θάνατο της μητέρας της, που η Έμα Ρέντφερν δεν γελούσε. Η ασθένεια της Σάρα Ρέντφερν είχε διαρκέσει σχεδόν έναν χρόνο, και μετά από αυτό η Έμα περιπλανιόταν σε μια πόλη που δεν ήξερε πώς να την προσεγγίσει, ένα μικρό γκρίζο φάντασμα κοριτσιού. Είχε πάρει το σκυλάκι της Μάρθας νωρίτερα αυτόν τον μήνα, το είχε πάρει, το είχε κρύψει και το είχε κρατήσει, από μια θλίψη τόσο μεγάλη που δεν χωρούσε μέσα σε ένα οκτάχρονο παιδί. Ολόκληρη η πόλη είχε βγει στους δρόμους για να το ψάξει. Τους είχα βρει και τους δύο στο τέλος, το κορίτσι και τον σκύλο μαζί σε μια παλιά αποθήκη, και αυτή η εύρεση ήταν η αρχή της επιστροφής της Έμα στον εαυτό της. Τώρα έβγαζε βόλτα τον σκύλο τρία απογεύματα την εβδομάδα, μια διευθέτηση που η Μάρθα είχε επινοήσει εκ του μηδενός για να δώσει σε ένα μοναχικό παιδί έναν λόγο να σηκωθεί και κάτι ζεστό για το οποίο θα ήταν υπεύθυνη, και είχε πιάσει, πλάγια, χωρίς κανείς να πει ποτέ δυνατά για ποιον λόγο γινόταν.</w:t>
-      </w:r>
-    </w:p>
-    <w:p/>
-    <w:p>
-      <w:r>
-        <w:t>Ο σκύλος ήταν εδώ τώρα, στην πραγματικότητα. Ο Σνόουμπολ καθόταν στα πόδια της Έμα φορώντας ένα πλεκτό καπέλο με κέρατα ελαφιού, ελαφρώς μεγαλύτερο για το κεφάλι του, και κοιτούσε την Πιπ αφ' υψηλού με βαθιά καχυποψία.</w:t>
+        <w:t xml:space="preserve">Το γέλιο της βγήκε φωτεινό και ξαφνικό, ένα αληθινό γέλιο, από εκείνα που ξεφεύγουν από ένα παιδί πριν αποφασίσει αν θα το αφήσει, και μου έκανε περισσότερο καλό από μια ολόκληρη εβδομάδα ύπνου, επειδή είχε περάσει ένα μεγάλο διάστημα, μετά τον θάνατο της μητέρας της, που η Έμα Ρέντφερν δεν γελούσε. Η ασθένεια της Σάρας Ρέντφερν είχε διαρκέσει σχεδόν έναν χρόνο, και μετά από αυτό η Έμα περιπλανιόταν σε μια πόλη που δεν ήξερε πώς να την προσεγγίσει, ένα μικρό γκρίζο φάντασμα κοριτσιού. Είχε πάρει το σκυλάκι της Μάρθας νωρίτερα αυτόν τον μήνα, το είχε πάρει, το είχε κρύψει και το είχε κρατήσει, από μια θλίψη τόσο μεγάλη που δεν χωρούσε μέσα σε ένα οκτάχρονο παιδί. Ολόκληρη η πόλη είχε βγει στους δρόμους για να το ψάξει. Τους είχα βρει και τους δύο στο τέλος, το κορίτσι και τον σκύλο μαζί σε μια παλιά αποθήκη, και αυτή η εύρεση ήταν η αρχή της επιστροφής της Έμας στον εαυτό της. Τώρα έβγαζε βόλτα τον σκύλο τρία απογεύματα την εβδομάδα, μια διευθέτηση που η Μάρθα είχε επινοήσει εκ του μηδενός για να δώσει σε ένα μοναχικό παιδί έναν λόγο να σηκωθεί και κάτι ζεστό για το οποίο θα ήταν υπεύθυνη, και είχε πιάσει, πλάγια, χωρίς κανείς να πει ποτέ δυνατά για ποιον λόγο γινόταν.</w:t>
+      </w:r>
+    </w:p>
+    <w:p/>
+    <w:p>
+      <w:r>
+        <w:t xml:space="preserve">Ο σκύλος ήταν εδώ τώρα, στην πραγματικότητα. Ο Σνόουμπολ καθόταν στα πόδια της Έμας φορώντας ένα πλεκτό καπέλο με κέρατα ελαφιού, ελαφρώς μεγαλύτερο για το κεφάλι του, και κοιτούσε την Πιπ αφ' υψηλού με βαθιά καχυποψία.</w:t>
       </w:r>
     </w:p>
     <w:p/>
@@ -3603,7 +3603,7 @@
     <w:p/>
     <w:p>
       <w:r>
-        <w:t xml:space="preserve">«Υπαρκτό γραφείο», είπε, πριν προλάβω καν να πω ένα γεια. «Παλιό, δύο πολιτείες πιο πέρα, κάνει ό,τι λέει ο άνθρωπός σου ότι κάνει: διαθήκες, κληρονομιές και εντοπισμό χαμένης περιουσίας για δικηγόρους που έχουν περισσότερα χρήματα παρά χρόνο. Και υπάρχει μια περιουσία των Μπλάκμπερν, Τζέσικα, μια αληθινή, τρέχουσα. Ο τελευταίος της γενιάς της Αδελαΐδα Μπλάκμπερν πέθανε στην πόλη αυτή την άνοιξη, χωρίς παιδιά, χωρίς αξιόλογη διαθήκη, και άφησε ένα τεράστιο μπέρδεμα. Ο δήμαρχός μας είναι από την πλευρά των ξαδέλφων, από την πλευρά που πήρε τη μύτη αλλά καθόλου τα χρήματα. Αυτός δεν αναφέρεται πουθενά. Ο Κάρτερ είναι καταγεγραμμένος στα βιβλία του γραφείου ως ο ερευνητής που προσέλαβαν για να ξεψαχνίσει την υπόθεση. Το έμαθα από μια υπάλληλο που επιβεβαίωσε τα πάντα χωρίς ούτε μια στιγμή να καταλάβει ότι επιβεβαίωνε κάτι. Είναι ακριβώς, απολύτως αυτός που σου είπε ότι είναι. Ένας σπιούνος με άδεια και λογαριασμό εξόδων».</w:t>
+        <w:t xml:space="preserve">«Υπαρκτό γραφείο», είπε, πριν προλάβω καν να πω ένα γεια. «Παλιό, δύο πολιτείες πιο πέρα, κάνει ό,τι λέει ο άνθρωπός σου ότι κάνει: διαθήκες, κληρονομιές και εντοπισμό χαμένης περιουσίας για δικηγόρους που έχουν περισσότερα χρήματα παρά χρόνο. Και υπάρχει μια περιουσία των Μπλάκμπερν, Τζέσικα, μια αληθινή, τρέχουσα. Ο τελευταίος της γενιάς της Αδελαΐδας Μπλάκμπερν πέθανε στην πόλη αυτή την άνοιξη, χωρίς παιδιά, χωρίς αξιόλογη διαθήκη, και άφησε ένα τεράστιο μπέρδεμα. Ο δήμαρχός μας είναι από την πλευρά των ξαδέλφων, από την πλευρά που πήρε τη μύτη αλλά καθόλου τα χρήματα. Αυτός δεν αναφέρεται πουθενά. Ο Κάρτερ είναι καταγεγραμμένος στα βιβλία του γραφείου ως ο ερευνητής που προσέλαβαν για να ξεψαχνίσει την υπόθεση. Το έμαθα από μια υπάλληλο που επιβεβαίωσε τα πάντα χωρίς ούτε μια στιγμή να καταλάβει ότι επιβεβαίωνε κάτι. Είναι ακριβώς, απολύτως αυτός που σου είπε ότι είναι. Ένας σπιούνος με άδεια και λογαριασμό εξόδων».</w:t>
       </w:r>
     </w:p>
     <w:p/>
@@ -3926,7 +3926,7 @@
     <w:p/>
     <w:p>
       <w:r>
-        <w:t xml:space="preserve">«Έλα», είπε, και άπλωσε το χέρι του. «Έχει φτάσει αρκετά μακριά τώρα. Και νομίζω ότι πρέπει να το δεις απόψε, από όλες τις νύχτες που υπάρχουν. Νομίζω ότι πρέπει να δεις για ποιο πράγμα υπάρχουμε, εσύ κι εγώ, προτού προχωρήσεις πιο βαθιά σε αυτό που έκαναν».</w:t>
+        <w:t xml:space="preserve">«Έλα», είπε, και άπλωσε το χέρι του. «Έχει προχωρήσει αρκετά τώρα. Και νομίζω ότι πρέπει να το δεις απόψε, από όλες τις νύχτες που υπάρχουν. Νομίζω ότι πρέπει να δεις για ποιο πράγμα υπάρχουμε, εσύ κι εγώ, προτού προχωρήσεις πιο βαθιά σε αυτό που έκαναν».</w:t>
       </w:r>
     </w:p>
     <w:p/>
@@ -4220,7 +4220,7 @@
     </w:p>
     <w:p>
       <w:r>
-        <w:t xml:space="preserve">Στάθηκα μες στο χιόνι που έπεφτε ανάμεσα στους γείτονές μου με την Πιπ να γέρνει στο μποτάκι μου, το γαντοφορεμένο χέρι της Έμα να βρίσκει το δικό μου από τη μία πλευρά και της Φιόνας από την άλλη. Κοίταξα τα πάντα, τα φανάρια, το χιόνι, το χρυσό φως, τα εκατό πρόσωπα στραμμένα στον ουρανό, και κατάλαβα, με εκείνον τον βαθύ τρόπο που έρχεται πριν προλάβει το μυαλό να το συλλάβει, τι ακριβώς διακυβευόταν. Όχι ένα κτίριο. Ούτε καν ένα μυστικό. Αυτό. Αυτή η συγκέντρωση, αυτή η πόλη να δείχνει τον καλύτερο εαυτό της σε μια κρύα, φωτεινή μέρα. Ένας άντρας είχε απλώσει το χέρι του από το σκοτάδι για να ζητήσει λύτρα για ένα κομμάτι αυτού του πράγματος, για να το μετατρέψει σε όπλο και φόβο. Στεκόμενη εκεί στο χιόνι, το μυαλό μου έγινε σκληρό και καθαρό σαν το κρύο. Όποιο κι αν ήταν το κόστος για μένα, δεν θα τον άφηνα να κρατήσει τη λαβή του πάνω σε αυτό. Θα το έφερνα στο φως, σε μια μέρα σαν κι αυτή, όπου τα πράγματα μπορούσαν να γιατρευτούν.</w:t>
+        <w:t xml:space="preserve">Στάθηκα μες στο χιόνι που έπεφτε ανάμεσα στους γείτονές μου με την Πιπ να γέρνει στο μποτάκι μου, το γαντοφορεμένο χέρι της Έμας να βρίσκει το δικό μου από τη μία πλευρά και της Φιόνας από την άλλη. Κοίταξα τα πάντα, τα φανάρια, το χιόνι, το χρυσό φως, τα εκατό πρόσωπα στραμμένα στον ουρανό, και κατάλαβα, με εκείνον τον βαθύ τρόπο που έρχεται πριν προλάβει το μυαλό να το συλλάβει, τι ακριβώς διακυβευόταν. Όχι ένα κτίριο. Ούτε καν ένα μυστικό. Αυτό. Αυτή η συγκέντρωση, αυτή η πόλη να δείχνει τον καλύτερο εαυτό της σε μια κρύα, φωτεινή μέρα. Ένας άντρας είχε απλώσει το χέρι του από το σκοτάδι για να ζητήσει λύτρα για ένα κομμάτι αυτού του πράγματος, για να το μετατρέψει σε όπλο και φόβο. Στεκόμενη εκεί στο χιόνι, το μυαλό μου έγινε σκληρό και καθαρό σαν το κρύο. Όποιο κι αν ήταν το κόστος για μένα, δεν θα τον άφηνα να κρατήσει τη λαβή του πάνω σε αυτό. Θα το έφερνα στο φως, σε μια μέρα σαν κι αυτή, όπου τα πράγματα μπορούσαν να γιατρευτούν.</w:t>
       </w:r>
     </w:p>
     <w:p>
@@ -4339,7 +4339,7 @@
     </w:p>
     <w:p>
       <w:r>
-        <w:t xml:space="preserve">Ανέβηκα στο κρεβάτι με αυτή τη σκέψη να γυρίζει μέσα μου, και για πρώτη φορά εδώ και μέρες υπήρχε κάτι κάτω από τον φόβο, μια παγωμένη, καθαρή ανακούφιση. Το σχήμα ήταν λάθος επειδή έλειπε ένα κομμάτι, και ξαπλωμένη εκεί στο σκοτάδι ήξερα ποιανού ήταν το κομμάτι. Είχα δει μια γυναίκα να γίνεται άκαμπτη στο άκουσμα ενός ονόματος. Είχα δει τα συρτάρια να στέκονται στην πλάτη της. Και την είχα ακούσει να μου λέει, με το συμβόλαιο του </w:t>
+        <w:t xml:space="preserve">Ανέβηκα για ύπνο με αυτή τη σκέψη να γυρίζει μέσα μου, και για πρώτη φορά εδώ και μέρες υπήρχε κάτι κάτω από τον φόβο, μια παγωμένη, καθαρή ανακούφιση. Το σχήμα ήταν λάθος επειδή έλειπε ένα κομμάτι, και ξαπλωμένη εκεί στο σκοτάδι ήξερα ποιανού ήταν το κομμάτι. Είχα δει μια γυναίκα να γίνεται άκαμπτη στο άκουσμα ενός ονόματος. Είχα δει τα συρτάρια να στέκονται πίσω της. Και την είχα ακούσει να μου λέει, με το συμβόλαιο του </w:t>
       </w:r>
       <w:r>
         <w:t xml:space="preserve"/>
@@ -4854,7 +4854,7 @@
     <w:p/>
     <w:p>
       <w:r>
-        <w:t xml:space="preserve">«Βέρα», είπα. «Ο Θίο είχε την κλοπή. Αλλά τα σημειώματα ήξεραν ότι το πανδοχείο είχε αγοραστεί με τα λεφτά από την καρφίτσα, και αυτό δεν υπήρχε ποτέ σε κανένα γράμμα των Μπλάκμπερν. Αυτό είναι αρχείο ιδιοκτησίας. Ένα συμβόλαιο. Και το συμβόλαιο αυτού του πανδοχείου καθόταν έξω από το συρτάρι του στο καλάθι επαναρχειοθέτησής σας χθες το πρωί, πιασμένο, στο γραφείο μιας γυναίκας που μου είχε πει δύο φορές ότι ποτέ δεν διαβάζει τα αρχεία στην πλάτη της».</w:t>
+        <w:t xml:space="preserve">«Βέρα», είπα. «Ο Θίο είχε την κλοπή. Αλλά τα σημειώματα ήξεραν ότι το πανδοχείο είχε αγοραστεί με τα λεφτά από την καρφίτσα, και αυτό δεν υπήρχε ποτέ σε κανένα γράμμα των Μπλάκμπερν. Αυτό είναι αρχείο ιδιοκτησίας. Ένα συμβόλαιο. Και το συμβόλαιο αυτού του πανδοχείου καθόταν έξω από το συρτάρι του στο καλάθι επαναρχειοθέτησής σας χθες το πρωί, πιασμένο, στο γραφείο μιας γυναίκας που μου είχε πει δύο φορές ότι ποτέ δεν διαβάζει τα αρχεία που έχει πίσω της».</w:t>
       </w:r>
     </w:p>
     <w:p/>
@@ -4878,7 +4878,7 @@
     <w:p/>
     <w:p>
       <w:r>
-        <w:t xml:space="preserve">«Ήρθε σε μένα, είπε. Πριν από εβδομάδες. Σχεδόν τρελαμένος με αυτό, μιλώντας για την Εταιρεία, για το πώς είχε βρει αυτό το πράγμα και δεν μπορούσε να το κάνει μόνος του. Και έπρεπε να πω όχι. Ξέρω ότι έπρεπε να πω όχι, το ήξερα και τότε».</w:t>
+        <w:t xml:space="preserve">«Ήρθε σε μένα», είπε. «Πριν από εβδομάδες. Σχεδόν τρελαμένος με αυτό, μιλώντας για την Εταιρεία, για το πώς είχε βρει αυτό το πράγμα και δεν μπορούσε να το κάνει μόνος του. Και έπρεπε να πω όχι. Ξέρω ότι έπρεπε να πω όχι, το ήξερα και τότε».</w:t>
       </w:r>
     </w:p>
     <w:p/>
@@ -5741,13 +5741,13 @@
     <w:p/>
     <w:p>
       <w:r>
-        <w:t xml:space="preserve">Κάθε γυναίκα στον κύκλο είχε φέρει το δικό της έλατο, κι εγώ είχα φέρει τον τρόπο του Βορείου Πόλου για το δέσιμό του, που η Ολίβια ορκιζόταν να μου κλέψει πριν από τα Χριστούγεννα. Στερέωσα αργά το σύρμα στον σκελετό, ώστε να μπορούν όλες να παρακολουθούν. Μόνο τότε έπιασα την πρώτη χούφτα έλατο. Η μυρωδιά αναδύθηκε κρύα και πράσινη, αρκετά κοφτερή για να καθαρίσει το μυαλό. Γέμισε το μπροστινό δωμάτιο του Yarn Tales όπως το μαλλί του μαγαζιού δεν μπόρεσε ποτέ ακριβώς. Κάτσαμε εκεί με ρετσίνι στα δάχτυλα και έναν γυμνό σκελετό στα γόνατά μου, μία από τις επτά γυναίκες σκυμμένες πάνω στην ίδια δουλειά. Υπάρχουν χειρότεροι τρόποι να περάσεις το πρώτο ελεύθερο πρωινό του Νοεμβρίου.</w:t>
-      </w:r>
-    </w:p>
-    <w:p/>
-    <w:p>
-      <w:r>
-        <w:t xml:space="preserve">Το χιόνι είχε έρθει τη νύχτα. Όχι το πρώιμο χιόνι του Οκτωβρίου, που είχε λιώσει ξανά μέσα σε μερικές ήπιες μέρες. Αληθινό χιόνι. Το χιόνι της καρδιάς του χειμώνα, που είχε αρχίσει το Χάλογουιν και θα έμενε ως την άνοιξη. Έστρωνε κατά μήκος της Λεωφόρου Έβεργκριν τώρα σε ένα καλό, καθαρό πάχος δεκαπέντε εκατοστών, τρίζοντας κάτω από τα πόδια όταν κάποιος έμπαινε χτυπώντας τα. Μέσα σε μια νύχτα τα μαγαζιά είχαν αρχίσει να ανταλλάσσουν τους σκελετούς και τα φαναράκια τους με καλαμποκόχορτα και χάρτινες γαλοπούλες, αν και οι απλές κολοκύθες έμειναν στα σκαλοπάτια, καλές ως την Ημέρα των Ευχαριστιών. Η λεωφόρος είχε ησυχάσει μετά το Χάλογουιν, στη νεκρή περίοδο πριν από τη μακριά, φωτεινή εξόρμηση προς τα Χριστούγεννα.</w:t>
+        <w:t xml:space="preserve">Κάθε γυναίκα στον κύκλο είχε φέρει το δικό της έλατο, κι εγώ είχα φέρει τον τρόπο του Βορείου Πόλου για το δέσιμό του, που η Ολίβια ορκιζόταν να μου κλέψει πριν από τα Χριστούγεννα. Στερέωσα αργά το σύρμα στον σκελετό, ώστε να μπορούν όλες να παρακολουθούν. Μόνο τότε έπιασα την πρώτη χούφτα έλατο. Η μυρωδιά αναδύθηκε κρύα και πράσινη, αρκετά κοφτερή για να καθαρίσει το μυαλό. Γέμισε το μπροστινό δωμάτιο του Yarn Tales όπως το μαλλί του μαγαζιού δεν μπόρεσε ποτέ ακριβώς. Κάθισα εκεί με ρετσίνι στα δάχτυλα και έναν γυμνό σκελετό στα γόνατά μου, μία από τις επτά γυναίκες σκυμμένες πάνω στην ίδια δουλειά. Υπάρχουν χειρότεροι τρόποι να περάσεις το πρώτο ελεύθερο πρωινό του Νοεμβρίου.</w:t>
+      </w:r>
+    </w:p>
+    <w:p/>
+    <w:p>
+      <w:r>
+        <w:t xml:space="preserve">Το χιόνι είχε έρθει τη νύχτα. Όχι το πρώιμο χιόνι του Οκτωβρίου, που είχε λιώσει ξανά μέσα σε μερικές ήπιες μέρες. Αληθινό χιόνι. Το χιόνι της καρδιάς του χειμώνα, που είχε αρχίσει το Χάλογουιν και θα έμενε ως την άνοιξη. Έστρωνε κατά μήκος της Λεωφόρου Έβεργκριν τώρα σε ένα καλό, καθαρό πάχος δεκαπέντε εκατοστών, τρίζοντας κάτω από τα πόδια όταν κάποιος έμπαινε χτυπώντας τα. Μέσα στο Σαββατοκύριακο τα μαγαζιά είχαν ανταλλάξει τους σκελετούς και τα φαναράκια τους με καλαμποκόχορτα και χάρτινες γαλοπούλες, αν και οι απλές κολοκύθες έμειναν στα σκαλοπάτια, καλές ως την Ημέρα των Ευχαριστιών. Η λεωφόρος είχε ησυχάσει μετά το Χάλογουιν, στη νεκρή περίοδο πριν από τη μακριά, φωτεινή εξόρμηση προς τα Χριστούγεννα.</w:t>
       </w:r>
     </w:p>
     <w:p/>
@@ -5879,7 +5879,7 @@
     <w:p/>
     <w:p>
       <w:r>
-        <w:t xml:space="preserve">Άφησε ένα κουτί ζαχαροπλαστείου στο μέγεθος κουτιού καπέλου πάνω στο τραπέζι ανάμεσα στα κουκουνάρια και την κορδέλα, και έβαλε τις γροθιές στη μέση της για να μας επιθεωρήσει. Η Γκρέτα είχε το Holly Jolly Bakery κάτω στη λεωφόρο, και ήταν χτισμένη σαν τα ντόνατς της, στρογγυλή και πασπαλισμένη παντού. Αυτό το πρωινό υπήρχε αλεύρι σε όλη την ποδιά της που δεν είχε μπει στον κόπο να τινάξει.</w:t>
+        <w:t xml:space="preserve">Άφησε ένα κουτί ζαχαροπλαστείου στο μέγεθος κουτιού καπέλου πάνω στο τραπέζι ανάμεσα στα κουκουνάρια και την κορδέλα, και έβαλε τις γροθιές στη μέση της για να μας επιθεωρήσει. Η Γκρέτα είχε το Holly Jolly Bakery κάτω στη λεωφόρο, και ήταν χτισμένη σαν τα ντόνατς της, στρογγυλή, ζεστή και πασπαλισμένη παντού. Αυτό το πρωινό υπήρχε αλεύρι σε όλη την ποδιά της που δεν είχε μπει στον κόπο να τινάξει.</w:t>
       </w:r>
     </w:p>
     <w:p/>
@@ -5903,7 +5903,7 @@
     <w:p/>
     <w:p>
       <w:r>
-        <w:t xml:space="preserve">Ήταν ήδη έτοιμη να σηκώσει το καπάκι. Η μυρωδιά αναδύθηκε και αναμίχθηκε με το έλατο στη μέση του δωματίου, σοκολάτα και καστανή ζάχαρη απλωμένες πάνω σε κρύο πράσινο πεύκο. Ήταν, σκέφτηκα, όσο πιο κοντά στη μυρωδιά ολόκληρης της ερχόμενης σεζόν όσο οτιδήποτε γνώριζα.</w:t>
+        <w:t xml:space="preserve">Ήταν ήδη έτοιμη να σηκώσει το καπάκι. Η μυρωδιά αναδύθηκε και αναμίχθηκε με το έλατο στη μέση του δωματίου, σοκολάτα, πεκάν και καστανή ζάχαρη απλωμένες πάνω σε κρύο πράσινο πεύκο. Ήταν, σκέφτηκα, όσο πιο κοντά στη μυρωδιά ολόκληρης της ερχόμενης σεζόν όσο οτιδήποτε γνώριζα.</w:t>
       </w:r>
     </w:p>
     <w:p/>
@@ -6041,7 +6041,7 @@
     <w:p/>
     <w:p>
       <w:r>
-        <w:t xml:space="preserve">Στεκόταν με την πλάτη στον δρόμο τώρα, με τα ξύλινα χέρια του πεταμένα προς τα δύο πλευρά, το άμορφο πρόσωπο από κάρβουνο στραμμένο μακριά προς τα πάνω στο πάρκο προς τα μαγαζιά. Προς, αν ήθελε κανείς να είναι ακριβής σχετικά με αυτό, το απώτερο άκρο του τετραγώνου όπου το παλιό μαγαζί του Φένγουικ βρισκόταν πίσω από το καφέ χαρτί του. Οι άλλοι δύο εξακολουθούσαν να κοιτάζουν τον δρόμο. Μόνο ο μεσαίος είχε μετακινηθεί. Στραμμένος ολόκληρος στη βάση του για να κοιτάξει προς την άλλη κατεύθυνση. Και δεν υπήρχε ούτε μία πατημασιά πουθενά κοντά του. Το χιόνι γύρω και από τους τρεις έδειχνε λείο και απάτητο. Δεκαπέντε εκατοστά καθαρή χιονόπτωση της νύχτας, χωρίς τίποτα γραμμένο μέσα σε αυτήν εκτός από τη μακριά μπλε σκιά του μνημείου των πεσόντων.</w:t>
+        <w:t xml:space="preserve">Στεκόταν με την πλάτη στον δρόμο τώρα, με τα ξύλινα χέρια του πεταμένα προς τα δύο πλευρά, το άμορφο πρόσωπο από κάρβουνο στραμμένο μακριά προς τα πάνω στο πάρκο προς τα μαγαζιά. Προς, αν ήθελε κανείς να είναι ακριβής σχετικά με αυτό, το απώτερο άκρο του τετραγώνου όπου το παλιό μαγαζί του Φένγουικ βρισκόταν πίσω από το καφέ χαρτί του. Οι άλλοι δύο εξακολουθούσαν να κοιτάζουν τον δρόμο. Μόνο ο μεσαίος είχε μετακινηθεί. Στραμμένος ολόκληρος στη βάση του για να κοιτάξει προς την άλλη κατεύθυνση. Και δεν υπήρχε ούτε μία πατημασιά πουθενά κοντά του. Το χιόνι γύρω και από τους τρεις έδειχνε λείο και απάτητο. Δεκαπέντε εκατοστά καθαρή χιονόπτωση της νύχτας, χωρίς τίποτα γραμμένο μέσα σε αυτήν εκτός από τις μακριές μπλε σκιές του κιγκλιδώματος του περιπτέρου της μπάντας.</w:t>
       </w:r>
     </w:p>
     <w:p/>
@@ -6083,7 +6083,7 @@
     <w:p/>
     <w:p>
       <w:r>
-        <w:t xml:space="preserve">Επειδή ήξερα τη διαφορά. Είχα ζήσει πολύ καιρό τώρα δίπλα στη μαγεία των Χριστουγέννων. Αρκετά ώστε να τη γνωρίζω στα κόκαλά μου, απλή σαν βήμα στη σκάλα μου. Αυτό δεν ήταν ένα παιδί με κρύα δάχτυλα. Η μαγεία κυκλοφορούσε ελεύθερη στο Φροστ Φολς. Ήταν ελεύθερη από τότε που φτάσαμε, ψάχνοντας για σπίτι. Ο σύζυγός μου έχτιζε ένα. Αργά και υπομονετικά στο εργαστήριό του, μια εστία για να εγκατασταθεί, και πλησίαζε λίγο πιο κοντά στη φωτιά κάθε μέρα. Αλλά δεν είχε εγκατασταθεί ακόμα. Ήταν ακόμα έξω στην πόλη τη νύχτα, αδέξια και εντελώς χωρίς κακία, κάνοντας τα μικρά αδύνατα πράγματα που κάνει η μαγεία όταν έχει περισσότερο συναίσθημα παρά μυαλό. Άλλαζε τα φώτα του φεστιβάλ από πορτοκαλί σε χρυσά. Και τώρα, απ’ ό,τι φαινόταν, γύριζε τον χιονάνθρωπο ενός παιδιού μέσα στο σκοτάδι για να κοιτάξει ό,τι κι αν είχε τραβήξει την περιπλανώμενη προσοχή του.</w:t>
+        <w:t xml:space="preserve">Επειδή ξέρω τη διαφορά. Έχω ζήσει πολύ καιρό τώρα δίπλα στη μαγεία των Χριστουγέννων. Αρκετά ώστε να τη γνωρίζω στα κόκαλά μου, απλή σαν βήμα στη σκάλα μου. Αυτό δεν ήταν ένα παιδί με κρύα δάχτυλα. Η μαγεία κυκλοφορούσε ελεύθερη στο Φροστ Φολς. Ήταν ελεύθερη από τότε που φτάσαμε, ψάχνοντας για σπίτι. Ο σύζυγός μου έχτιζε ένα. Αργά και υπομονετικά στο εργαστήριό του, μια εστία για να εγκατασταθεί, και πλησίαζε λίγο πιο κοντά στη φωτιά κάθε μέρα. Αλλά δεν είχε εγκατασταθεί ακόμα. Ήταν ακόμα έξω στην πόλη τη νύχτα, ζεστή, αδέξια και εντελώς χωρίς κακία, κάνοντας τα μικρά αδύνατα πράγματα που κάνει η μαγεία όταν έχει περισσότερο συναίσθημα παρά μυαλό. Άλλαζε τα φώτα του φεστιβάλ από πορτοκαλί σε χρυσά. Και τώρα, απ’ ό,τι φαινόταν, γύριζε τον χιονάνθρωπο ενός παιδιού μέσα στο σκοτάδι για να κοιτάξει ό,τι κι αν είχε τραβήξει την περιπλανώμενη προσοχή του.</w:t>
       </w:r>
     </w:p>
     <w:p/>

</xml_diff>

<commit_message>
WIP checkpoint: full proofcheck in progress (Inn Trouble Greek)
Co-Authored-By: Claude Opus 5.5 <noreply@anthropic.com>
Claude-Session: https://claude.ai/code/session_012Cm8JxdqzjuttdUSdkQCUg
</commit_message>
<xml_diff>
--- a/translated/corrected/Inn Trouble - ASSEMBLED - FORMATTED_Greek.docx
+++ b/translated/corrected/Inn Trouble - ASSEMBLED - FORMATTED_Greek.docx
@@ -160,7 +160,7 @@
     </w:p>
     <w:p>
       <w:r>
-        <w:t>Έβγαλε ένα κοφτό τσίκ, το σύντομο, κοφτερό τσίκ που σήμαινε «βιαστείτε», τίναξε τα φτερά της ουράς της και βγήκε κουνιστά στη βεράντα μόλις άνοιξα την πόρτα, σαν να περίμενε εκείνη εμένα και όχι το αντίθετο.</w:t>
+        <w:t xml:space="preserve">Έβγαλε ένα κοφτό τσίκ, το σύντομο, κοφτερό τσίκ που σήμαινε «βιάσου», τίναξε τα φτερά της ουράς της και βγήκε κουνιστά στη βεράντα μόλις άνοιξα την πόρτα, σαν να περίμενε εκείνη εμένα και όχι το αντίθετο.</w:t>
       </w:r>
     </w:p>
     <w:p/>
@@ -371,7 +371,7 @@
     </w:p>
     <w:p>
       <w:r>
-        <w:t xml:space="preserve">«Κλος». Χαμογέλασε, και ήταν ένα καλό χαμόγελο, άνετο και εξασκημένο, αλλά το εμπιστεύτηκα όσο θα μπορούσα να πετάξω το παραπέτασμα του τζακιού.</w:t>
+        <w:t xml:space="preserve">«Κλος». Χαμογέλασε, και ήταν ένα καλό χαμόγελο, άνετο και εξασκημένο, αλλά δεν το εμπιστευόμουν πιο μακριά απ' όσο θα μπορούσα να πετάξω το παραπέτασμα του τζακιού.</w:t>
       </w:r>
     </w:p>
     <w:p>
@@ -391,7 +391,7 @@
     </w:p>
     <w:p>
       <w:r>
-        <w:t xml:space="preserve">«Πρέπει οπωσδήποτε να φροντίσω την τραπεζαρία», είπε βιαστικά, και εξαφανίστηκε πίσω από την περιστρεφόμενη πόρτα πριν προλάβει κάποιος από εμάς να πει λέξη, αφήνοντας το καλάθι με την πίτα στο γραφείο και την ερώτηση να αιωρείται στον αέρα πίσω της.</w:t>
+        <w:t xml:space="preserve">«Πρέπει οπωσδήποτε να φροντίσω την τραπεζαρία», είπε βιαστικά, και εξαφανίστηκε πίσω από την πόρτα που ανοιγόκλεινε πριν προλάβει κάποιος από εμάς να πει λέξη, αφήνοντας το καλάθι με την πίτα στο γραφείο και την ερώτηση να αιωρείται στον αέρα πίσω της.</w:t>
       </w:r>
     </w:p>
     <w:p>

</xml_diff>

<commit_message>
Full proofcheck Inn Trouble Greek: SIGNIFICANT (103 fixes)
Co-Authored-By: Claude Opus 5.5 <noreply@anthropic.com>
Claude-Session: https://claude.ai/code/session_012Cm8JxdqzjuttdUSdkQCUg
</commit_message>
<xml_diff>
--- a/translated/corrected/Inn Trouble - ASSEMBLED - FORMATTED_Greek.docx
+++ b/translated/corrected/Inn Trouble - ASSEMBLED - FORMATTED_Greek.docx
@@ -492,7 +492,7 @@
     <w:p/>
     <w:p>
       <w:r>
-        <w:t xml:space="preserve">Το τηλεφώνημα ήρθε το επόμενο πρωί, ενώ τα χέρια μου ήταν χωμένα μέχρι τους καρπούς στη ζύμη για πίτα, και κατάλαβα ότι κάτι δεν πήγαινε καλά προτού καν προλάβω να τα σκουπίσω, επειδή το τηλέφωνο στο σπίτι μας δεν χτυπούσε σχεδόν ποτέ. Οι άνθρωποι έρχονταν στην πόρτα, ως επί το πλείστον, ή έστελναν κάποιο παιδί με ένα σημείωμα, ή σε πετύχαιναν στην αγορά. Όταν το τηλέφωνο χτυπούσε, ήταν συνήθως η Ολίβια, που ήθελε να μάθει αν είχα δει το καινούργιο μερινό μαλλί που είχε φέρει, ή η Μάρθα, για να μου θυμίσει ποιο απόγευμα θα γινόταν η συνάντηση του κύκλου. Οπότε, όταν χτύπησε στις οκτώμιση το πρωί ενός μουντού πρωινού, διαπεραστικά μεσ' στη σιωπή της κουζίνας, το στομάχι μου σφίχτηκε προτού καν προλάβω να διασχίσω το δωμάτιο.</w:t>
+        <w:t xml:space="preserve">Το τηλεφώνημα ήρθε το επόμενο πρωί, ενώ τα χέρια μου ήταν χωμένα μέχρι τους καρπούς στη ζύμη για πίτα, και κατάλαβα ότι κάτι δεν πήγαινε καλά προτού καν προλάβω να τα σκουπίσω, επειδή το τηλέφωνο στο σπίτι μας δεν χτυπούσε σχεδόν ποτέ. Οι άνθρωποι έρχονταν στην πόρτα, ως επί το πλείστον, ή έστελναν κάποιο παιδί με ένα σημείωμα, ή σε πετύχαιναν στην αγορά. Όταν το τηλέφωνο χτυπούσε, ήταν συνήθως η Ολίβια, που ήθελε να μάθει αν είχα δει το καινούργιο μερινό μαλλί που είχε φέρει, ή η Μάρθα, για να μου θυμίσει ποιο απόγευμα θα γινόταν η συνάντηση του κύκλου. Οπότε, όταν χτύπησε στις οκτώμιση ένα μουντό πρωινό, διαπεραστικά μεσ' στη σιωπή της κουζίνας, το στομάχι μου σφίχτηκε προτού καν προλάβω να διασχίσω το δωμάτιο.</w:t>
       </w:r>
     </w:p>
     <w:p/>
@@ -534,7 +534,7 @@
     <w:p/>
     <w:p>
       <w:r>
-        <w:t xml:space="preserve">Σκέπασα το ανοιχτό ζυμάρι με ένα βρεγμένο πανί για να μη ξεραθεί και έβγαλα το παλτό μου από τον γάντζο δίπλα στην πόρτα. Η Πιπ ήταν εκεί προτού καν προλάβω να κουμπώσω το πρώτο κουμπί, κουνώντας το σώμα της σε έναν σφιχτό, ανήσυχο κύκλο.</w:t>
+        <w:t xml:space="preserve">Σκέπασα το ανοιχτό ζυμάρι με ένα βρεγμένο πανί για να μη ξεραθεί και έβγαλα το παλτό μου από τον γάντζο δίπλα στην πόρτα. Η Πιπ ήταν εκεί προτού καν προλάβω να κουμπώσω το πρώτο κουμπί, κάνοντας κουνιστά έναν σφιχτό, ανήσυχο κύκλο.</w:t>
       </w:r>
     </w:p>
     <w:p/>
@@ -552,7 +552,7 @@
     <w:p/>
     <w:p>
       <w:r>
-        <w:t xml:space="preserve">Το Winter Wonderland Inn πρόβαλε μπροστά μου καθώς στρίβαμε προς το πάρκο, η γκριζοπράσινη πρόσοψή του και το στεφάνι του με τη χρυσή κορδέλα ακριβώς όπως ήταν την προηγούμενη μέρα, κι όμως ολόκληρο το μέρος μου φαινόταν διαφορετικό τώρα, αλλαγμένο μόνο από το γεγονός και μόνο ότι ήξερα πως υπήρχε μπελάς στο εσωτερικό του. Το στεφάνι αιχμαλώτιζε το πρωινό φως. Τα παράθυρα ήταν σκοτεινά εκτός από ένα.</w:t>
+        <w:t xml:space="preserve">Το Winter Wonderland Inn πρόβαλε μπροστά μου καθώς στρίβαμε προς το πάρκο, η γκριζοπράσινη πρόσοψή του και το στεφάνι του με τη χρυσή κορδέλα ακριβώς όπως ήταν την προηγούμενη μέρα, κι όμως ολόκληρο το μέρος μου φαινόταν διαφορετικό τώρα, αλλαγμένο μόνο από το γεγονός ότι ήξερα πως υπήρχε μπελάς στο εσωτερικό του. Το στεφάνι αιχμαλώτιζε το πρωινό φως. Τα παράθυρα ήταν σκοτεινά εκτός από ένα.</w:t>
       </w:r>
     </w:p>
     <w:p/>
@@ -564,7 +564,7 @@
     <w:p/>
     <w:p>
       <w:r>
-        <w:t xml:space="preserve">Η Φιόνα εμφανίστηκε από μια πλαϊνή πόρτα προτού φτάσω στα μισά, με το πρόσωπό της καταπονημένο και χλωμό, τη ζακέτα της κουμπωμένη σωστά σήμερα αλλά όλα τα υπόλοιπα πάνω της λάθος. Έπιασε το χέρι μου με ένα παγωμένο χέρι και με τράβηξε μέσα στο μικρό καθιστικό δίπλα στο λόμπι, αυτό που κρατούσε για ιδιωτικές συζητήσεις και απογευματινό τσάι με φίλους. Έκλεισε την πόρτα πίσω μας, και οι πνιχτοί ήχοι του ξυπνημένου πανδοχείου χάθηκαν. Το ρολόι με το εκκρεμές στη γωνία χτυπούσε. Ήταν το πιο δυνατό πράγμα στο δωμάτιο.</w:t>
+        <w:t xml:space="preserve">Η Φιόνα εμφανίστηκε από μια πλαϊνή πόρτα προτού φτάσω στα μισά, με το πρόσωπό της καταπονημένο και χλωμό, τη ζακέτα της κουμπωμένη σωστά σήμερα αλλά όλα τα υπόλοιπα πάνω της λάθος. Έπιασε το χέρι μου με ένα παγωμένο χέρι και με τράβηξε μέσα στο μικρό καθιστικό δίπλα στο λόμπι, αυτό που κρατούσε για ιδιωτικές συζητήσεις και απογευματινό τσάι με φίλους. Έκλεισε την πόρτα πίσω μας, και οι πνιχτοί ήχοι του πανδοχείου που ξυπνούσε χάθηκαν. Το ρολόι με το εκκρεμές στη γωνία χτυπούσε. Ήταν το πιο δυνατό πράγμα στο δωμάτιο.</w:t>
       </w:r>
     </w:p>
     <w:p/>
@@ -606,7 +606,7 @@
     <w:p/>
     <w:p>
       <w:r>
-        <w:t xml:space="preserve">Το διάβασα δύο φορές. Το ρολόι με το εκκρεμές χτυπούσε. Κάτι στη διατύπωση με σκόνταψε. Το ζαφείρι στην καρδιά της. Ένας παράξενος, μαλακός, σχεδόν τρυφερός τρόπος για έναν εκβιαστή να ονομάσει μια κλεμμένη πέτρα, σαν φράση βγαλμένη από βιβλίο. Το άφησα να φύγει. Είχα μεγαλύτερα πράγματα μπροστά μου εκείνη τη στιγμή παρά τη στροφή της φράσης ενός ξένου.</w:t>
+        <w:t xml:space="preserve">Το διάβασα δύο φορές. Το ρολόι με το εκκρεμές χτυπούσε. Κάτι στη διατύπωση με έκανε να σκοντάψω. Το ζαφείρι στην καρδιά της. Ένας παράξενος, μαλακός, σχεδόν τρυφερός τρόπος για έναν εκβιαστή να ονομάσει μια κλεμμένη πέτρα, σαν φράση βγαλμένη από βιβλίο. Το προσπέρασα. Είχα μεγαλύτερα πράγματα μπροστά μου εκείνη τη στιγμή παρά τη στροφή της φράσης ενός ξένου.</w:t>
       </w:r>
     </w:p>
     <w:p/>
@@ -660,7 +660,7 @@
     <w:p/>
     <w:p>
       <w:r>
-        <w:t xml:space="preserve">«Την πήγε δύο πόλεις πιο πέρα, στο Ρίτζλαϊν, σε ένα ενεχυροδανειστήριο εκεί, και την πούλησε. Και με τα χρήματα». Η φωνή της Φιόνας έσπασε καθαρά στη μέση. «Με τα χρήματα αγόρασε αυτό το πανδοχείο. Αυτό εδώ. Το Winter Wonderland Inn. Έτσι απέκτησε η οικογένειά μου την ιδιοκτησία του. Αυτό είναι το θεμέλιο πάνω στο οποίο στέκεται ολόκληρο το πράγμα. Εκατό χρόνια Χριστούγεννα και γάμοι, πρωινά της Κυριακής, ταξιδιώτες μέσα από το χιόνι, και κάτω από όλα αυτά, να τα στηρίζει, μια καρφίτσα που ένα τρομοκρατημένο κορίτσι έκλεψε από τους ανθρώπους για τους οποίους δούλευε».</w:t>
+        <w:t xml:space="preserve">«Την πήγε δύο πόλεις πιο πέρα, στο Ρίτζλαϊν, σε ένα ενεχυροδανειστήριο εκεί, και την πούλησε. Και με τα χρήματα». Η φωνή της Φιόνας έσπασε καθαρά στη μέση. «Με τα χρήματα αγόρασε αυτό το πανδοχείο. Αυτό εδώ. Το Winter Wonderland Inn. Έτσι απέκτησε η οικογένειά μου την ιδιοκτησία του. Αυτό είναι το θεμέλιο πάνω στο οποίο στέκεται ολόκληρο το πράγμα. Εκατό χρόνια Χριστούγεννα και γάμοι, πρωινά της Κυριακής, ταξιδιώτες που έβρισκαν καταφύγιο από το χιόνι, και κάτω από όλα αυτά, να τα στηρίζει, μια καρφίτσα που ένα τρομοκρατημένο κορίτσι έκλεψε από τους ανθρώπους για τους οποίους δούλευε».</w:t>
       </w:r>
     </w:p>
     <w:p/>
@@ -729,7 +729,7 @@
     <w:p/>
     <w:p>
       <w:r>
-        <w:t xml:space="preserve">«Τότε σκέψου μαζί μου μια στιγμή», είπα, «επειδή αυτό έχει μεγαλύτερη σημασία από οτιδήποτε άλλο. Όποιος έγραψε αυτό το σημείωμα ξέρει τι υπήρχε σε αυτό το κλειδωμένο μπαούλο. Και υπάρχουν μόνο δύο τρόποι με τους οποίους κάποιος μαθαίνει τι υπάρχει σε ένα κλειδωμένο μπαούλο που μόνο εσύ έχεις ανοίξει. Είτε έχει μπει με κάποιον τρόπο στο μπαούλο σου, το οποίο μου λες ότι είναι αδύνατον». Σήκωσα ένα δάχτυλο. «Ή έχει φτάσει στο ίδιο μυστικό από την άλλη πλευρά. Την πλευρά των Μπλάκμπερν. Επειδή οι Μπλάκμπερν έχασαν μια καρφίτσα το 1924, δεν την έχασαν; Μια τέτοια οικογένεια, θα το είχαν γράψει κάτω. Ένα γράμμα, ένας οικιακός λογαριασμός, ένα σημείωμα στον ασφαλιστή, κάτι. Η δική τους εκδοχή της ιστορίας υπάρχει κάπου, ξεχωριστή από τη δική σου».</w:t>
+        <w:t xml:space="preserve">«Τότε σκέψου μαζί μου μια στιγμή», είπα, «επειδή αυτό έχει μεγαλύτερη σημασία από οτιδήποτε άλλο. Όποιος έγραψε αυτό το σημείωμα ξέρει τι υπήρχε σε αυτό το κλειδωμένο μπαούλο. Και υπάρχουν μόνο δύο τρόποι με τους οποίους κάποιος μαθαίνει τι υπάρχει σε ένα κλειδωμένο μπαούλο που μόνο εσύ έχεις ανοίξει. Είτε έχει μπει με κάποιον τρόπο στο μπαούλο σου, το οποίο μου λες ότι είναι αδύνατον». Σήκωσα ένα δάχτυλο. «Ή έχει φτάσει στο ίδιο μυστικό από την άλλη πλευρά. Την πλευρά των Μπλάκμπερν. Επειδή οι Μπλάκμπερν έχασαν μια καρφίτσα το 1924, δεν την έχασαν; Μια τέτοια οικογένεια, θα το είχαν καταγράψει. Ένα γράμμα, ένας οικιακός λογαριασμός, ένα σημείωμα στον ασφαλιστή, κάτι. Η δική τους εκδοχή της ιστορίας υπάρχει κάπου, ξεχωριστή από τη δική σου».</w:t>
       </w:r>
     </w:p>
     <w:p/>
@@ -759,7 +759,7 @@
     <w:p/>
     <w:p>
       <w:r>
-        <w:t xml:space="preserve">«Πάρ' τα». Άφησε να φύγει μια ανάσα που ήταν σχεδόν γέλιο, το φθαρμένο είδος που δεν έχει απομείνει καθόλου γέλιο μέσα του. «Πάρ' τα, και σε παρακαλώ, Τζέσικα, σε παρακαλώ κάνε το να σταματήσει. Ξαγρυπνώ κάθε βράδυ κάνοντας πράξεις στο σκοτάδι. Δεν το έχω. Πεντακόσιες χιλιάδες δολάρια. Δεν έχω ούτε το ένα δέκατο. Έχω ένα πανδοχείο γεμάτο αγάπη, ένα σωρό λογαριασμούς στο συρτάρι του γραφείου και την καλή εβδομάδα των Γούορθινγκτον. Αυτά είναι όσα έχω σε αυτόν τον κόσμο».</w:t>
+        <w:t xml:space="preserve">«Πάρ' τα». Άφησε να φύγει μια ανάσα που ήταν σχεδόν γέλιο, το φθαρμένο είδος που δεν έχει απομείνει καθόλου γέλιο μέσα του. «Πάρ' τα, και σε παρακαλώ, Τζέσικα, σε παρακαλώ κάνε το να σταματήσει. Ξαγρυπνώ κάθε βράδυ κάνοντας λογαριασμούς στο σκοτάδι. Δεν το έχω. Πεντακόσιες χιλιάδες δολάρια. Δεν έχω ούτε το ένα δέκατο. Έχω ένα πανδοχείο γεμάτο αγάπη, ένα σωρό λογαριασμούς στο συρτάρι του γραφείου και την καλή εβδομάδα των Γούορθινγκτον. Αυτά είναι όσα έχω σε αυτόν τον κόσμο».</w:t>
       </w:r>
     </w:p>
     <w:p/>
@@ -813,7 +813,7 @@
     <w:p/>
     <w:p>
       <w:r>
-        <w:t>Τσίριξε και πήρε θέση δίπλα μου. Γυρίσαμε σπίτι μέσα από την ξυπνημένη πόλη, και κράτησα το χέρι μου πιεσμένο πάνω από το σημείωμα σε όλη τη διαδρομή και δεν κοίταξα ψηλά στα γιορτινά φώτα κατά μήκος των γείσων.</w:t>
+        <w:t xml:space="preserve">Τσίριξε και πήρε θέση δίπλα μου. Γυρίσαμε σπίτι μέσα από την πόλη που ξυπνούσε, και κράτησα το χέρι μου πιεσμένο πάνω από το σημείωμα σε όλη τη διαδρομή και δεν κοίταξα ψηλά στα γιορτινά φώτα κατά μήκος των γείσων.</w:t>
       </w:r>
     </w:p>
     <w:p>
@@ -854,7 +854,7 @@
     <w:p/>
     <w:p>
       <w:r>
-        <w:t>«Άρα το ερώτημα δεν είναι ποιος μισεί τη Φιόνα», είπε. «Επειδή κανείς δεν μισεί τη Φιόνα. Δεν θα έβρισκες ούτε μία ψυχή σε αυτή την πόλη να πει κακή κουβέντα για εκείνη ακόμη κι αν πρόσφερες αμοιβή. Το ερώτημα είναι ποιος έχει διαβάσει τα έγγραφα των Μπλάκμπερν».</w:t>
+        <w:t xml:space="preserve">«Άρα το ερώτημα δεν είναι ποιος μισεί τη Φιόνα», είπε. «Επειδή κανείς δεν μισεί τη Φιόνα. Δεν θα έβρισκες ούτε μία ψυχή σε αυτή την πόλη να πει κακή κουβέντα για εκείνη ακόμη κι αν πρόσφερες αμοιβή. Το ερώτημα είναι ποιος έχει διαβάσει τα χαρτιά των Μπλάκμπερν».</w:t>
       </w:r>
     </w:p>
     <w:p/>
@@ -902,7 +902,7 @@
     <w:p/>
     <w:p>
       <w:r>
-        <w:t xml:space="preserve">Αυτό ήταν σωστό, και με ηρέμησε περισσότερο απ' ό,τι η σούπα, επειδή μετέτρεπε μια άρρωστη, παραπαίουσα υποψία για έναν φίλο σε μια ερώτηση πάνω στην οποία μπορούσα να δουλέψω. Κάπου, κάποιος είχε σταθεί ανάμεσα στα κουτιά των Μπλάκμπερν, μέσα στη σιωπή, και είχε διαβάσει όσα δεν είχαν καμία δουλειά να διαβάσουν, και είχε διακρίνει το σχήμα μισού εκατομμυρίου δολαρίων μέσα σε αυτά. Αυτό το πρόσωπο μπορεί να ήταν ο Θίο. Μπορεί και όχι. Έπρεπε να το μάθω δίκαια.</w:t>
+        <w:t xml:space="preserve">Αυτό ήταν σωστό, και με ηρέμησε περισσότερο απ' ό,τι η σούπα, επειδή μετέτρεπε μια άρρωστη, παραπαίουσα υποψία για έναν φίλο σε μια ερώτηση πάνω στην οποία μπορούσα να δουλέψω. Κάπου, κάποιος είχε σταθεί ανάμεσα στα κουτιά των Μπλάκμπερν, μέσα στη σιωπή, και είχε διαβάσει όσα δεν είχε καμία δουλειά να διαβάσει, και είχε διακρίνει το σχήμα μισού εκατομμυρίου δολαρίων μέσα σε αυτά. Αυτό το πρόσωπο μπορεί να ήταν ο Θίο. Μπορεί και όχι. Έπρεπε να το μάθω δίκαια.</w:t>
       </w:r>
     </w:p>
     <w:p/>
@@ -1075,7 +1075,7 @@
     <w:p/>
     <w:p>
       <w:r>
-        <w:t xml:space="preserve">Η Ιστορική Εταιρεία του Φροστ Φολς στεγαζόταν σε ένα στενό τούβλινο κτίριο στην πλατεία, και το πρωί που άνοιξε η έκθεση αρχείου, είχε περισσότερο κόσμο να μπαινοβγαίνει απ' όσο είχα δει ποτέ εκεί έξω. Το πεζοδρόμιο μπροστά ήταν ένα αργό ποτάμι από παλτό. Κάποιος είχε κρεμάσει ένα πανό πάνω από την πόρτα, ζωγραφισμένο στο χέρι, </w:t>
+        <w:t xml:space="preserve">Η Ιστορική Εταιρεία του Φροστ Φολς στεγαζόταν σε ένα στενό τούβλινο κτίριο στην πλατεία, και το πρωί που άνοιξε η έκθεση αρχείου, είχε περισσότερο κόσμο να μπαινοβγαίνει απ' όσο είχα δει ποτέ εκεί. Το πεζοδρόμιο μπροστά ήταν ένα αργό ποτάμι από παλτό. Κάποιος είχε κρεμάσει ένα πανό πάνω από την πόρτα, ζωγραφισμένο στο χέρι, </w:t>
       </w:r>
       <w:r>
         <w:rPr>
@@ -1165,7 +1165,7 @@
     </w:p>
     <w:p>
       <w:r>
-        <w:t xml:space="preserve">«Κυρία Κλος». Ο Νιλ δεν σήκωσε το κεφάλι από το γυαλί. «Συναρπαστικά, όλα αυτά. Ο κύριος Χουσείν σας έχει κάνει μια πραγματική υπηρεσία στην πόλη, είτε το ξέρει η πόλη είτε όχι. Κοιτάξτε εδώ». Έδειξε την προθήκη, με το ένα δάχτυλο να μην αγγίζει εντελώς το γυαλί. «Μια ολόκληρη συνεχιζόμενη αλληλογραφία σχετικά με το νοικοκυριό. Ποιος προσλήφθηκε, ποιος απολύθηκε, τι αγοράστηκε, τι πουλήθηκε». Γύρισε τότε το κεφάλι του, και το χαμόγελο κατέφτασε. «Τι χάθηκε».</w:t>
+        <w:t xml:space="preserve">«Κυρία Κλος». Ο Νιλ δεν σήκωσε το κεφάλι από το γυαλί. «Συναρπαστικά, όλα αυτά. Ο δικός σας κύριος Χουσείν έχει προσφέρει πραγματική υπηρεσία στην πόλη, είτε το ξέρει η πόλη είτε όχι. Κοιτάξτε εδώ». Έδειξε την προθήκη, με το ένα δάχτυλο να μην αγγίζει εντελώς το γυαλί. «Μια ολόκληρη συνεχιζόμενη αλληλογραφία σχετικά με το νοικοκυριό. Ποιος προσλήφθηκε, ποιος απολύθηκε, τι αγοράστηκε, τι πουλήθηκε». Γύρισε τότε το κεφάλι του, και το χαμόγελο κατέφτασε. «Τι χάθηκε».</w:t>
       </w:r>
     </w:p>
     <w:p>
@@ -1236,7 +1236,7 @@
     <w:p/>
     <w:p>
       <w:r>
-        <w:t xml:space="preserve">Το χαρτί στις προθήκες ήταν παλιό, καφέ, εύθραυστο στις πτυχώσεις. Αλλά στο μπροστινό γραφείο, δίπλα στο επίπεδο κουτί της Βέρας, υπήρχε μια στοίβα από τα επιστολόχαρτα της Εταιρείας, το άγραφο χαρτί που χρησιμοποιούσαν για τις ετικέτες και το επιστολόχαρτο, σε χρώμα κρέμ, λίγο πιο βαρύ από το συνηθισμένο χαρτί, με μια αμυδρή ριγέ υφή αποτυπωμένη πάνω του, λεπτές παράλληλες γραμμές που θα πρόσεχες μόνο αν το κρατούσες στο φως ή είχες λόγο να κοιτάξεις.</w:t>
+        <w:t xml:space="preserve">Το χαρτί στις προθήκες ήταν παλιό, καφέ, εύθραυστο στις πτυχώσεις. Αλλά στο μπροστινό γραφείο, δίπλα στο επίπεδο κουτί της Βέρας, υπήρχε μια στοίβα από τα επιστολόχαρτα της Εταιρείας, το άγραφο χαρτί που χρησιμοποιούσαν για τις ετικέτες και το επιστολόχαρτο, σε χρώμα κρεμ, λίγο πιο βαρύ από το συνηθισμένο χαρτί, με μια αμυδρή ριγέ υφή αποτυπωμένη πάνω του, λεπτές παράλληλες γραμμές που θα πρόσεχες μόνο αν το κρατούσες στο φως ή είχες λόγο να κοιτάξεις.</w:t>
       </w:r>
     </w:p>
     <w:p/>
@@ -1272,7 +1272,7 @@
     <w:p/>
     <w:p>
       <w:r>
-        <w:t xml:space="preserve">Αλλά τη δίπλωσα στην τσέπη του παλτό μου παρ' όλα αυτά, δίπλα στο σημείωμα. Ισιώθηκα και κοίταξα πίσω στη ζεστή, γεμάτη κόσμο αίθουσα για τελευταία φορά. Στον Θίο, σκυμμένο τώρα στο τραπέζι με τον χυμό μήλου, να διηγείται σε ένα μικρό αγόρι την ίδρυση της πόλης με όλη του την κουρασμένη καρδιά, τα μάτια του αγοριού ορθάνοιχτα. Στη Βέρα, δίπλα στο γραφείο, να ισιώνει το κουτί με τα χαρτιά της κατά ένα τελευταίο μισό εκατοστό. Στον Νιλ Κάρτερ, δίπλα στη βιτρίνα, να γράφει κάτι στο σημειωματάριό του. Και στη στοίβα με τα κρέμ επιστολόχαρτα δίπλα στον αγκώνα της Βέρας, που έπιαναν το φως.</w:t>
+        <w:t xml:space="preserve">Αλλά τη δίπλωσα στην τσέπη του παλτό μου παρ' όλα αυτά, δίπλα στο σημείωμα. Ισιώθηκα και κοίταξα πίσω στη ζεστή, γεμάτη κόσμο αίθουσα για τελευταία φορά. Στον Θίο, σκυμμένο τώρα στο τραπέζι με τον χυμό μήλου, να διηγείται σε ένα μικρό αγόρι την ίδρυση της πόλης με όλη του την κουρασμένη καρδιά, τα μάτια του αγοριού ορθάνοιχτα. Στη Βέρα, δίπλα στο γραφείο, να ισιώνει το κουτί με τα χαρτιά της κατά ένα τελευταίο μισό εκατοστό. Στον Νιλ Κάρτερ, δίπλα στη βιτρίνα, να γράφει κάτι στο σημειωματάριό του. Και στη στοίβα με τα κρεμ επιστολόχαρτα δίπλα στον αγκώνα της Βέρας, που έπιαναν το φως.</w:t>
       </w:r>
     </w:p>
     <w:p/>
@@ -1424,7 +1424,7 @@
     </w:p>
     <w:p>
       <w:r>
-        <w:t xml:space="preserve">Το να ξέρεις ότι το μυστικό προήλθε από τα χαρτιά σού λέει πού να σταθείς, είχε πει ο Νικ. Όχι ποιος. Πάρα πολλοί άνθρωποι στο Φροστ Φολς λυπούνταν τον Θίο. Οι μισοί κάτοικοι θα είχαν κλάψει αν μάθαιναν πόσο άσχημα ήταν τα πράγματα. Το να λυπάσαι έναν άνθρωπο, ακόμα κι αν είναι ο πιο απελπισμένος άνθρωπος στην πόλη, δεν είναι το ίδιο με το να απειλείς έναν φίλο για χρήματα, και δεν θα άφηνα το ένα να γλιστρήσει μέσα στο άλλο στο μυαλό μου χωρίς κάτι παραπάνω από αριθμητική και μια κακή διαίσθηση. Συνέχισα λοιπόν να πλέκω, κράτησα τη γροθιά μου ανοιχτή και κράτησα την υποψία ανάλαφρη, σαν κάρβουνο, έτοιμη να την αφήσω να πέσει.</w:t>
+        <w:t xml:space="preserve">Το να ξέρεις ότι το μυστικό προήλθε από τα χαρτιά σού λέει πού να σταθείς, είχε πει ο Νικ. Όχι ποιος. Πάρα πολλοί άνθρωποι στο Φροστ Φολς λυπούνταν τον Θίο. Οι μισοί κάτοικοι θα είχαν κλάψει αν μάθαιναν πόσο άσχημα ήταν τα πράγματα. Το να λυπάται κανείς έναν άνθρωπο, ακόμα και το να είναι κανείς ο πιο απελπισμένος άνθρωπος στην πόλη, δεν είναι το ίδιο με το να απειλεί έναν φίλο για χρήματα, και δεν θα άφηνα το ένα να γλιστρήσει μέσα στο άλλο στο μυαλό μου χωρίς κάτι παραπάνω από αριθμητική και μια κακή διαίσθηση. Συνέχισα λοιπόν να πλέκω, κράτησα τη γροθιά μου ανοιχτή και κράτησα την υποψία ανάλαφρη, σαν κάρβουνο, έτοιμη να την αφήσω να πέσει.</w:t>
       </w:r>
     </w:p>
     <w:p>
@@ -1516,7 +1516,7 @@
     <w:p/>
     <w:p>
       <w:r>
-        <w:t xml:space="preserve">Το πάρκο ήταν το μέρος όπου θα γινόταν το φεστιβάλ, ο μεγάλος κοινόχρηστος χώρος νότια της Έβεργκριν που κατέβαινε από την πλατεία, με το ηρώο κοντά στην αρχή και τη μεγάλη φτελιά στην άλλη άκρη. Όλη η πόλη είχε κινητοποιηθεί για να το ετοιμάσει. Υπήρχαν τραπέζια με ανοιγόμενα πόδια που έπρεπε να μεταφερθούν και να στηθούν σε σειρές, μια σκηνή που θα υψωνόταν στη βόρεια άκρη, και κάτι που έμοιαζε με χίλιες μικρές κολοκύθες, οι οποίες έπρεπε να τακτοποιηθούν κατά τρόπο που υποτίθεται ότι θα έδειχνε ατημέλητος. Στην πραγματικότητα, η επιτροπή θα ασχολούνταν σχολαστικά μαζί τους επί μία ώρα. Είχα έρθει μόνο για να παραδώσω στην επιτροπή του φεστιβάλ τα πρώτα δώδεκα ζευγάρια γάντια του κύκλου, και μέσα σε ενενήντα δευτερόλεπτα από την άφιξή μου, ένας άγνωστος άντρας μου είχε βάλει στα χέρια ένα κιβώτιο με κολοκύθες για πίτα και μου είχε πει: «Βάλ' τες μπροστά από τη σκηνή, θέλεις να το κάνεις; Πρόσεχε τη μαλακή». Έτσι πήγαιναν τα πράγματα σε αυτή την πόλη, και δεν με πείραζε καθόλου. Δεν γινόταν να σκέφτομαι έχοντας μια κούτα με κολοκύθες στην αγκαλιά μου, και αυτό με βόλευε μια χαρά.</w:t>
+        <w:t xml:space="preserve">Το πάρκο ήταν το μέρος όπου θα γινόταν το φεστιβάλ, ο μεγάλος κοινόχρηστος χώρος νότια της Έβεργκριν που κατέβαινε από την πλατεία, με το ηρώο κοντά στην αρχή και τη μεγάλη φτελιά στην άλλη άκρη. Όλη η πόλη είχε κινητοποιηθεί για να το ετοιμάσει. Υπήρχαν τραπέζια με ανοιγόμενα πόδια που έπρεπε να μεταφερθούν και να στηθούν σε σειρές, μια σκηνή που θα υψωνόταν στη βόρεια άκρη, και κάτι που έμοιαζε με χίλιες μικρές κολοκύθες, οι οποίες έπρεπε να τακτοποιηθούν κατά τρόπο που υποτίθεται ότι θα έδειχνε ατημέλητος. Στην πραγματικότητα, η επιτροπή θα ασχολούνταν σχολαστικά μαζί τους επί μία ώρα. Είχα έρθει μόνο για να παραδώσω στην επιτροπή του φεστιβάλ τα πρώτα δώδεκα ζευγάρια γάντια του κύκλου, και μέσα σε ενενήντα δευτερόλεπτα από την άφιξή μου, ένας άγνωστος άντρας μου είχε βάλει στα χέρια ένα κιβώτιο με κολοκύθες για πίτα και μου είχε πει: «Βάλτε τες μπροστά από τη σκηνή, θα μου κάνετε τη χάρη; Προσέξτε τη μαλακή». Έτσι πήγαιναν τα πράγματα σε αυτή την πόλη, και δεν με πείραζε καθόλου. Δεν γινόταν να σκέφτομαι έχοντας μια κούτα με κολοκύθες στην αγκαλιά μου, και αυτό με βόλευε μια χαρά.</w:t>
       </w:r>
     </w:p>
     <w:p/>
@@ -1570,7 +1570,7 @@
     <w:p/>
     <w:p>
       <w:r>
-        <w:t>Αυτό μου χάρισε άλλο ένα γέλιο, και πίσω του εμφανίστηκε ο Μαρκ Ρέντφερν με μια αγκαλιά πτυσσόμενες καρέκλες. Όταν τις άφησε κάτω, στάθηκε ίσιος και έσπρωξε τα μαλλιά του πίσω από το μέτωπο, είδα αυτό που ήλπιζα να δω στο πρόσωπό του: ανακούφιση. Ήταν ένας ψυχικά ράκος άνθρωπος όταν τον πρωτογνώρισα, που κρατούσε τον εαυτό του και την κόρη του όρθιους και με τα δύο χέρια χωρίς να του έχει απομείνει τίποτα άλλο. Τώρα είχε πάρει χρώμα. Κοίταξε την Έμα να γελάει με τον πιγκουίνο, και οι ώμοι του, σφιγμένοι για έναν ολόκληρο χρόνο, χαλάρωσαν.</w:t>
+        <w:t xml:space="preserve">Αυτό μου χάρισε άλλο ένα γέλιο, και πίσω του εμφανίστηκε ο Μαρκ Ρέντφερν με μια αγκαλιά πτυσσόμενες καρέκλες. Όταν τις άφησε κάτω, στάθηκε ίσιος και έσπρωξε τα μαλλιά του πίσω από το μέτωπο, είδα αυτό που ήλπιζα να δω στο πρόσωπό του: ανακούφιση. Ήταν ψυχικό ράκος όταν τον πρωτογνώρισα, που κρατούσε τον εαυτό του και την κόρη του όρθιους και με τα δύο χέρια χωρίς να του έχει απομείνει τίποτα άλλο. Τώρα είχε πάρει χρώμα. Κοίταξε την Έμα να γελάει με τον πιγκουίνο, και οι ώμοι του, σφιγμένοι για έναν ολόκληρο χρόνο, χαλάρωσαν.</w:t>
       </w:r>
     </w:p>
     <w:p/>
@@ -1678,7 +1678,7 @@
     <w:p/>
     <w:p>
       <w:r>
-        <w:t xml:space="preserve">Πλησίασα και κοίταξα. Μέσα από την υγρή πορτοκαλί σάρκα, την τελευταία εβδομάδα του Οκτωβρίου, είχε ξεφυτρώσει ένα κλαδάκι πουρνάρι: τρία σκούρα γυαλιστερά φύλλα, κοφτερά και αλάνθαστα, και ανάμεσά τους τρία κόκκινα μούρα στρογγυλά σαν σταγόνες αίματος, που φυτρώνανε μέσα σε μια χαλασμένη κολοκύθα του Χάλογουιν την ώρα που είχε περάσει από τότε που η Πιπ την είχε σκίσει.</w:t>
+        <w:t xml:space="preserve">Πλησίασα και κοίταξα. Μέσα από την υγρή πορτοκαλί σάρκα, την τελευταία εβδομάδα του Οκτωβρίου, είχε ξεφυτρώσει ένα κλαδάκι πουρνάρι: τρία σκούρα γυαλιστερά φύλλα, κοφτερά και αλάνθαστα, και ανάμεσά τους τρία κόκκινα μούρα στρογγυλά σαν σταγόνες αίματος, φυτρωμένο μέσα σε μια χαλασμένη κολοκύθα του Χάλογουιν την ώρα που είχε περάσει από τότε που η Πιπ την είχε σκίσει.</w:t>
       </w:r>
     </w:p>
     <w:p/>
@@ -1714,7 +1714,7 @@
     <w:p/>
     <w:p>
       <w:r>
-        <w:t xml:space="preserve">«Δικό μας», συμφώνησα, και σταύρωσα τα χέρια μου στο στήθος, και την είδα να σκεπάζει με την παλάμη της το πουρνάρι για να το κρύψει από την πολυάσχολη επιτροπή σαν να κρατούσε ένα μικρό, ζεστό μυστικό ζωντανό ανάμεσα στις παλάμες της.</w:t>
+        <w:t xml:space="preserve">«Δικό μας», συμφώνησα, και έβαλα το χέρι στην καρδιά μου, και την είδα να σκεπάζει με την παλάμη της το πουρνάρι για να το κρύψει από την πολυάσχολη επιτροπή σαν να κρατούσε ένα μικρό, ζεστό μυστικό ζωντανό ανάμεσα στις παλάμες της.</w:t>
       </w:r>
     </w:p>
     <w:p/>
@@ -1761,7 +1761,7 @@
     <w:p/>
     <w:p>
       <w:r>
-        <w:t xml:space="preserve">Επέστρεψα στο πανδοχείο δύο μέρες αργότερα, όχι για να ερευνήσω τίποτα, αλλά επειδή η Φιόνα χρειαζόταν μια φίλη περισσότερο παρά μια ντετέκτιβ εκείνη τη στιγμή, κι εγώ ήμουν τόσο απασχολημένη με το πρώτο που παραλίγο να ξεχάσω να γίνω το δεύτερο.</w:t>
+        <w:t xml:space="preserve">Επέστρεψα στο πανδοχείο δύο μέρες αργότερα, όχι για να ερευνήσω τίποτα, αλλά επειδή η Φιόνα χρειαζόταν μια φίλη περισσότερο παρά μια ντετέκτιβ εκείνη τη στιγμή, κι εγώ ήμουν τόσο απασχολημένη με το δεύτερο που παραλίγο να ξεχάσω να είμαι το πρώτο.</w:t>
       </w:r>
     </w:p>
     <w:p/>
@@ -1851,7 +1851,7 @@
     <w:p/>
     <w:p>
       <w:r>
-        <w:t xml:space="preserve">Σκούπισε τα μάτια της και γέλασε, με υγρό τρόπο. </w:t>
+        <w:t xml:space="preserve">Σκούπισε τα μάτια της και γέλασε μέσα από τα δάκρυα. </w:t>
       </w:r>
     </w:p>
     <w:p/>
@@ -1869,13 +1869,13 @@
     <w:p/>
     <w:p>
       <w:r>
-        <w:t xml:space="preserve">Αυτό της έβγαλε ένα αληθινό γέλιο, εκείνο το βαθύ που έρχεται ξαφνικά, το γέλιο που μου είχε λείψει, και μου έκανε τόσο καλό να το ακούσω όσο και η σούπα σε εκείνη. Γυρίσαμε πίσω στις καρέκλες μαζί. Εγώ μετρούσα ενώ εκείνη έφτιαχνε όσες κουνιούνταν, και η Πιπ επέβλεπε από το ζεστό κομμάτι του ήλιου. Για μια ώρα το πανδοχείο ήταν ξανά απλώς ένα πανδοχείο, ζεστό και πολυάσχολο, που ετοιμαζόταν για ένα φεστιβάλ. Ό,τι κι αν γινόταν άλλο, αυτό άξιζε να προστατευτεί: η ζεστασιά που ένα τρομοκρατημένο κορίτσι είχε φτιάξει από το τίποτα και είχε παραδώσει μέσα σε εκατό χρόνια σε μια άλλη γυναίκα που μετρούσε καρέκλες.</w:t>
-      </w:r>
-    </w:p>
-    <w:p/>
-    <w:p>
-      <w:r>
-        <w:t>Η Πιπ κι εγώ περπατήσαμε σπίτι στο λυκόφως, και ήμουν πολύ πιο σίγουρη για το τι ακριβώς πολεμούσα.</w:t>
+        <w:t xml:space="preserve">Αυτό της έβγαλε ένα αληθινό γέλιο, εκείνο το βαθύ που έρχεται ξαφνικά, το γέλιο που μου είχε λείψει, και μου έκανε τόσο καλό να το ακούσω όσο και η σούπα σε εκείνη. Γυρίσαμε πίσω στις καρέκλες μαζί. Εγώ μετρούσα ενώ εκείνη έφτιαχνε όσες κουνιούνταν, και η Πιπ επέβλεπε από το ζεστό κομμάτι του ήλιου. Για μια ώρα το πανδοχείο ήταν ξανά απλώς ένα πανδοχείο, ζεστό και πολυάσχολο, που ετοιμαζόταν για ένα φεστιβάλ. Ό,τι κι αν γινόταν άλλο, αυτό άξιζε να προστατευτεί: η ζεστασιά που ένα τρομοκρατημένο κορίτσι είχε φτιάξει από το τίποτα και είχε παραδώσει μέσα από εκατό χρόνια σε μια άλλη γυναίκα που μετρούσε καρέκλες.</w:t>
+      </w:r>
+    </w:p>
+    <w:p/>
+    <w:p>
+      <w:r>
+        <w:t xml:space="preserve">Η Πιπ κι εγώ περπατήσαμε σπίτι στο λυκόφως, και ήμουν πολύ πιο σίγουρη για ποιο πράγμα ακριβώς πάλευα.</w:t>
       </w:r>
     </w:p>
     <w:p>
@@ -1928,7 +1928,7 @@
     <w:p/>
     <w:p>
       <w:r>
-        <w:t xml:space="preserve">Κι ενώ τη θαύμαζα, ανάσανα τη μυρωδιά του σιδηρουργείου, και να τη, αλάνθαστη, η ακριβής μυρωδιά που είχε κολλήσει σε ένα φύλλο κρεμ χαρτιού διπλωμένο στο παλτό μου. Ήταν πάνω στο σημείωμα, και ήταν κι εδώ. Και ανάγκασα τον εαυτό μου να κινηθεί αργά, ανάγκασα τον εαυτό μου να κρατήσει το κάρβουνο στην ανοιχτή μου παλάμη και να μη σφίξω τη γροθιά μου γύρω του, επειδή μια μυρωδιά δεν αποτελεί ομολογία. Ο Σαμ Πάτελ υπήρξε, από κάθε άποψη, απολύτως έντιμος με ολόκληρη αυτή την πόλη επί δέκα χρόνια, κι εγώ είχα έρθει για να κοιτάξω, όχι για να βγάλω συμπέρασμα.</w:t>
+        <w:t xml:space="preserve">Κι ενώ τη θαύμαζα, ανάσανα τη μυρωδιά του σιδηρουργείου, και να τη, αλάνθαστη, η ακριβής μυρωδιά που είχε κολλήσει σε ένα φύλλο κρεμ χαρτιού διπλωμένο στο παλτό μου. Ήταν πάνω στο σημείωμα, και ήταν κι εδώ. Και ανάγκασα τον εαυτό μου να κινηθεί αργά, ανάγκασα τον εαυτό μου να κρατήσει το κάρβουνο στην ανοιχτή μου παλάμη και να μη σφίξω τη γροθιά μου γύρω του, επειδή μια μυρωδιά δεν αποτελεί ομολογία. Ο Σαμ Πάτελ υπήρξε, απ' ό,τι έλεγαν όλοι, απολύτως έντιμος με ολόκληρη αυτή την πόλη επί δέκα χρόνια, κι εγώ είχα έρθει για να κοιτάξω, όχι για να βγάλω συμπέρασμα.</w:t>
       </w:r>
     </w:p>
     <w:p/>
@@ -1982,7 +1982,7 @@
     <w:p/>
     <w:p>
       <w:r>
-        <w:t xml:space="preserve">Κι αυτό, περισσότερο από οτιδήποτε άλλο, διέλυσε το τελευταίο κομμάτι της καχυποψίας μου, σχεδόν εξ ολοκλήρου, επειδή ένας άντρας που ετοιμάζει εκβιασμό δεν θα στεκόταν στο δικό του σιδηρουργείο με την καρδιά του στο πιάτο ρωτώντας αν η γυναίκα που απομυζούσε ήταν καλά. Αλλά το σχεδόν δεν είναι το ίδιο με το σίγουρος, κι εγώ κράτησα τη θέση μου, και ρώτησα το πράγμα για το οποίο είχα έρθει κατά το ήμισυ κάτω από τη μυρωδιά.</w:t>
+        <w:t xml:space="preserve">Κι αυτό, περισσότερο από οτιδήποτε άλλο, διέλυσε το τελευταίο κομμάτι της καχυποψίας μου, σχεδόν εξ ολοκλήρου, επειδή ένας άντρας που ετοιμάζει εκβιασμό δεν θα στεκόταν στο δικό του σιδηρουργείο με την καρδιά του στο πιάτο ρωτώντας αν η γυναίκα που απομυζούσε ήταν καλά. Αλλά το σχεδόν δεν είναι το ίδιο με το σίγουρα, κι εγώ κράτησα τη θέση μου, και ρώτησα αυτό που ήταν ο άλλος μισός λόγος της επίσκεψής μου, πίσω από τη μυρωδιά.</w:t>
       </w:r>
     </w:p>
     <w:p/>
@@ -2074,7 +2074,7 @@
     <w:p/>
     <w:p>
       <w:r>
-        <w:t>Είχα σκοπό να περάσω το πρωί στη δημόσια βιβλιοθήκη, ήσυχα, μελετώντας την ιστορία των Μπλάκμπερν. Τον βρήκα εκεί πριν από μένα, εγκατεστημένο στο μεγάλο δρύινο τραπέζι δίπλα στα ψηλά παράθυρα, με τρία αρχειακά κουτιά με δημοτικά έγγραφα ανοιχτά μπροστά του και ένα τέταρτο να το κουβαλάει η κυρία Τζόνσον, η οποία το ακούμπησε κάτω με την επιτηδευμένη φροντίδα μιας βιβλιοθηκονόμου που είχε αποφασίσει ότι ο συγκεκριμένος επισκέπτης θα της δημιουργούσε προβλήματα. Κρατούσε έναν μεγεθυντικό φακό στο ένα χέρι. Είχε τα γυαλιά ανάγνωσης σπρωγμένα ψηλά στα μαλλιά του και τα κανονικά του γυαλιά στη μύτη. Σήκωσε το κεφάλι του μόλις μπήκα από την πόρτα, σαν να με περίμενε, και μου έγνεψε να πλησιάσω.</w:t>
+        <w:t xml:space="preserve">Είχα σκοπό να περάσω το πρωί στη δημόσια βιβλιοθήκη, ήσυχα, μελετώντας την ιστορία των Μπλάκμπερν. Τον βρήκα εκεί πριν από μένα, εγκατεστημένο στο μεγάλο δρύινο τραπέζι δίπλα στα ψηλά παράθυρα, με τρία αρχειακά κουτιά με δημοτικά έγγραφα ανοιχτά μπροστά του και ένα τέταρτο να το κουβαλάει η κυρία Τζόνσον, η οποία το ακούμπησε κάτω με την επιτηδευμένη φροντίδα μιας βιβλιοθηκονόμου που είχε αποφασίσει ότι ο συγκεκριμένος επισκέπτης θα της δημιουργούσε προβλήματα. Κρατούσε έναν μεγεθυντικό φακό στο ένα χέρι. Είχε τα γυαλιά ανάγνωσης σπρωγμένα ψηλά στα μαλλιά του και τα κανονικά του γυαλιά στη μύτη. Σήκωσε το κεφάλι του μόλις μπήκα από την πόρτα, σαν να περίμενε κάποιον φίλο, και μου έγνεψε να πλησιάσω.</w:t>
       </w:r>
     </w:p>
     <w:p/>
@@ -2104,7 +2104,7 @@
     <w:p/>
     <w:p>
       <w:r>
-        <w:t xml:space="preserve">«Λατρεύω τις παλιές, ιστορικές οικογένειες. Όλη αυτή η ωμή, αρπακτική φιλοδοξία στην πρώτη γενιά, που καταλήγει σε ευυποληψία ως την τρίτη, και μέχρι την τέταρτη έχουν ξεχάσει ότι άρπαξαν ποτέ τίποτα. Είναι η ίδια ιστορία σε κάθε μικρή πόλη που έχω πατήσει ποτέ το πόδι μου».</w:t>
+        <w:t xml:space="preserve">«Λατρεύω τις οικογένειες των ιδρυτών. Όλη αυτή η ωμή, αρπακτική φιλοδοξία στην πρώτη γενιά, που καταλήγει σε ευυποληψία ως την τρίτη, και μέχρι την τέταρτη έχουν ξεχάσει ότι άρπαξαν ποτέ τίποτα. Είναι η ίδια ιστορία σε κάθε μικρή πόλη που έχω πατήσει ποτέ το πόδι μου».</w:t>
       </w:r>
     </w:p>
     <w:p/>
@@ -2158,7 +2158,7 @@
     <w:p/>
     <w:p>
       <w:r>
-        <w:t>Κάθισα σιωπηλή για μια στιγμή. Ήταν μια τεράστια δόση ειλικρίνειας, δοσμένη απλόχερα, χωρίς να τη ζητήσω, και καθώς καθόμουν εκεί, δεν μπορούσα να διακρίνω αν ήταν η καθαρή αλήθεια ή κάποιο επιδέξιο ψέμα.</w:t>
+        <w:t xml:space="preserve">Κάθισα σιωπηλή για μια στιγμή. Ήταν μια τεράστια δόση ειλικρίνειας, δοσμένη απλόχερα, χωρίς να τη ζητήσω, και καθώς καθόμουν εκεί, δεν μπορούσα να διακρίνω αν ήταν η καθαρή αλήθεια ή το πιο έξυπνο είδος ψέματος.</w:t>
       </w:r>
     </w:p>
     <w:p/>
@@ -2455,7 +2455,7 @@
     </w:p>
     <w:p>
       <w:r>
-        <w:t xml:space="preserve">Η Πιπ μυροκοπούσε κατά μήκος του κάτω κάγκελου του φράχτη του λιβαδιού όλη την ώρα. Είχα το σημείωμα στην τσέπη του παλτό μου, και τώρα έκανε αυτό που είχε αρχίσει να κάνει όποτε αυτό βρισκόταν κοντά. Ήρθε στην τσέπη, πίεσε το ράμφος της επίπεδο πάνω στην εξωτερική της πλευρά και έμεινε ακίνητη, στην ακινησία στην οποία έπεφτε όταν είχε πιάσει μια μυρωδιά και ήταν απολύτως σίγουρη γι' αυτήν. Έπειτα γύρισε και απομακρύνθηκε περπατώντας σαν πάπια μακριά μου με μεγάλη αποφασιστικότητα, κατευθείαν στο μονοπάτι για την πόρτα της κουζίνας, και περίμενε εκεί μέχρι να την ανοίξω. Διέσχισε το πάτωμα και σταμάτησε στο καλάθι όπου είχα αφήσει τη βάση κεριού που είχα κουβαλήσει σπίτι από το σιδηρουργείο εκείνο το πρωί. Κάθισε δίπλα στο καλάθι, με ξανακοίταξε και κελάηδησε, μία φορά, κοφτά και σίγουρα σαν δάχτυλο που δείχνει.</w:t>
+        <w:t xml:space="preserve">Η Πιπ μυροκοπούσε κατά μήκος του κάτω κάγκελου του φράχτη του λιβαδιού όλη την ώρα. Είχα το σημείωμα στην τσέπη του παλτό μου, και τώρα έκανε αυτό που είχε αρχίσει να κάνει όποτε αυτό βρισκόταν κοντά. Ήρθε στην τσέπη, πίεσε το ράμφος της επίπεδο πάνω στην εξωτερική της πλευρά και έμεινε ακίνητη, στην ακινησία στην οποία έπεφτε όταν είχε πιάσει μια μυρωδιά και βεβαιωνόταν γι' αυτήν. Έπειτα γύρισε και απομακρύνθηκε περπατώντας σαν πάπια μακριά μου με μεγάλη αποφασιστικότητα, κατευθείαν στο μονοπάτι για την πόρτα της κουζίνας, και περίμενε εκεί μέχρι να την ανοίξω. Διέσχισε το πάτωμα και σταμάτησε στο καλάθι όπου είχα αφήσει τη βάση κεριού που είχα κουβαλήσει σπίτι από το σιδηρουργείο εκείνο το πρωί. Κάθισε δίπλα στο καλάθι, με ξανακοίταξε και τσίριξε, μία φορά, κοφτά και σίγουρα σαν δάχτυλο που δείχνει.</w:t>
       </w:r>
     </w:p>
     <w:p>
@@ -2555,7 +2555,7 @@
         <w:t xml:space="preserve">ΣΥΜΒΟΛΑΙΑ. ΑΔΕΙΕΣ. ΦΟΡΟΛΟΓΙΚΑ ΜΗΤΡΩΑ. ΑΡΧΕΙΑ ΙΔΙΟΚΤΗΣΙΑΣ, 1900–1950.</w:t>
       </w:r>
       <w:r>
-        <w:t xml:space="preserve"> Ολόκληρη η χάρτινη μνήμη του ποιος κατείχε τι στο Φροστ Φολς, ένας αιώνας από αυτήν, στεκόταν στην πλάτη αυτής της κουρασμένης γυναίκας, και τα κλειδιά για όλα αυτά βρίσκονταν στον κρίκο στη μέση της.</w:t>
+        <w:t xml:space="preserve"> Ολόκληρη η χάρτινη μνήμη του ποιος κατείχε τι στο Φροστ Φολς, ένας αιώνας από αυτήν, στεκόταν πίσω από αυτή την κουρασμένη γυναίκα, και τα κλειδιά για όλα αυτά βρίσκονταν στον κρίκο στη μέση της.</w:t>
       </w:r>
     </w:p>
     <w:p/>
@@ -2663,7 +2663,7 @@
         <w:t xml:space="preserve"/>
       </w:r>
       <w:r>
-        <w:t xml:space="preserve"> κάπου σε εκείνα τα ίδια συρτάρια, και ό,τι είχε καταγράψει η πόλη το 1924 όταν μια καρφίτσα είχε κάνει φτερά από ένα αρχοντικό, αν είχε καταγραφεί απολύτως τίποτα. Μια γυναίκα που είχε σφιχτεί στις λέξεις αρχεία ιδιοκτησίας και είχε γίνει υπερβολικά λαλίστατη τη στιγμή που είχα πει το όνομα Μπλάκμπερν, για να μου πει μετά, με τα αρχεία να στέκονται στην πλάτη της, ότι δεν τα διάβαζε ποτέ.</w:t>
+        <w:t xml:space="preserve"> κάπου σε εκείνα τα ίδια συρτάρια, και ό,τι είχε καταγράψει η πόλη το 1924 όταν μια καρφίτσα είχε κάνει φτερά από ένα αρχοντικό, αν είχε καταγραφεί απολύτως τίποτα. Μια γυναίκα που είχε σφιχτεί στις λέξεις αρχεία ιδιοκτησίας και είχε γίνει υπερβολικά λαλίστατη τη στιγμή που είχα πει το όνομα Μπλάκμπερν, για να μου πει μετά, με τα αρχεία να στέκονται πίσω της, ότι δεν τα διάβαζε ποτέ.</w:t>
       </w:r>
     </w:p>
     <w:p/>
@@ -2721,7 +2721,7 @@
     </w:p>
     <w:p>
       <w:r>
-        <w:t xml:space="preserve">«Αυτό λένε τα μαθηματικά». Ο Θίο έβγαλε τα γυαλιά του και πίεσε τα δάχτυλά του στη ρίζα της μύτης του, και για μια στιγμή η προσεκτική φωνή λύγισε. «Έχω κάνει αιτήσεις παντού. Θέλω να το ξέρετε όλοι αυτό. Κάθε επιχορήγηση, κάθε ίδρυμα, κάθε ταμείο σε τρεις πολιτείες. Έχω έναν φάκελο με τις απορρίψεις. Θα μπορούσα να ταπετσαρώσω αυτό το δωμάτιο μ' αυτές, και τουλάχιστον τότε το δωμάτιο θα ήταν στεγνό». Μερικοί από αυτούς γέλασαν, το θλιμμένο, ανήμπορο γέλιο ανθρώπων που βρίσκονται στο τέλος των επιλογών τους. «Ο δήμος δεν πρόκειται να βοηθήσει. Πήγα στον δήμαρχο ο ίδιος την περασμένη άνοιξη, και η κυρία Κλος εδώ πήγε ξανά σήμερα το πρωί, και λέει το ίδιο πράγμα που λέει πάντα. Η ιστορία δεν καθαρίζει τους δρόμους από το χιόνι». Άφησε τα γυαλιά του πάνω στα χαρτιά του. «Δεν ξέρω τι άλλο να δοκιμάσω. Δοκίμασα να είμαι λογικός. Δοκίμασα να ζητήσω έλεος. Δεν ντρέπομαι να σας πω ότι δοκίμασα να ζητήσω έλεος, γραπτώς, σε ένα ίδρυμα στην πόλη, και μου έστειλαν ένα πολύ ευγενικό γράμμα λέγοντας όχι».</w:t>
+        <w:t xml:space="preserve">«Αυτό λένε τα μαθηματικά». Ο Θίο έβγαλε τα γυαλιά του και πίεσε τα δάχτυλά του στη ρίζα της μύτης του, και για μια στιγμή η προσεκτική φωνή λύγισε. «Έχω κάνει αιτήσεις παντού. Θέλω να το ξέρετε όλοι αυτό. Κάθε επιχορήγηση, κάθε ίδρυμα, κάθε ταμείο σε τρεις πολιτείες. Έχω έναν φάκελο με τις απορρίψεις. Θα μπορούσα να ταπετσαρώσω αυτό το δωμάτιο μ' αυτές, και τουλάχιστον τότε το δωμάτιο θα ήταν στεγνό». Μερικοί από αυτούς γέλασαν, το θλιμμένο, ανήμπορο γέλιο ανθρώπων που βρίσκονται στο τέλος των επιλογών τους. «Ο δήμος δεν πρόκειται να βοηθήσει. Πήγα στον δήμαρχο ο ίδιος την περασμένη άνοιξη, και η κυρία Κλος εδώ πήγε ξανά σήμερα το πρωί, και λέει το ίδιο πράγμα που λέει πάντα. Η ιστορία δεν καθαρίζει τους δρόμους από το χιόνι». Άφησε τα γυαλιά του πάνω στα χαρτιά του. «Δεν ξέρω τι άλλο να δοκιμάσω. Δοκίμασα να είμαι λογικός. Δοκίμασα να ζητήσω έλεος. Δεν ντρέπομαι να σας πω ότι δοκίμασα να ζητήσω έλεος, γραπτώς, σε ένα ίδρυμα στη μεγαλούπολη, και μου έστειλαν ένα πολύ ευγενικό γράμμα λέγοντας όχι».</w:t>
       </w:r>
     </w:p>
     <w:p>
@@ -2746,7 +2746,7 @@
     </w:p>
     <w:p>
       <w:r>
-        <w:t xml:space="preserve">Η Κλερ έφυγε για να γράψει την ευγενική, θλιμμένη ιστορία της που δεν επρόκειτο να ταράξει τίποτα. Έμεινα για να βοηθήσω τον Θίο, και στοίβαξα καρέκλες μαζί με τον άντρα που είχα αρχίσει να υποψιάζομαι ότι εκβίαζε τη φίλη μου. Με ευχαρίστησε γι' αυτό τρεις φορές. Μετά μου μίλησε για εκείνη τη φορά το 1936 που μια πλημμύρα παραλίγο να πάρει τα αρχικά αρχεία της πόλης, και καμιά ντουζίνα πολίτες είχαν σχηματίσει μια αλυσίδα για να μεταφέρουν τα κουτιά σε ψηλότερο έδαφος. Αυτή ήταν η πόλη στα καλύτερά της, είπε, άνθρωποι που κουβαλούσαν το παρελθόν στην ασφάλεια με τα χέρια τους, και το σκεφτόταν αυτό στις άσχημες νύχτες.</w:t>
+        <w:t xml:space="preserve">Η Κλερ έφυγε για να γράψει την ευγενική, θλιμμένη ιστορία της που δεν θα απελευθέρωνε τίποτα. Έμεινα για να βοηθήσω τον Θίο, και στοίβαξα καρέκλες μαζί με τον άντρα που είχα αρχίσει να υποψιάζομαι ότι εκβίαζε τη φίλη μου. Με ευχαρίστησε γι' αυτό τρεις φορές. Μετά μου μίλησε για εκείνη τη φορά το 1936 που μια πλημμύρα παραλίγο να πάρει τα αρχικά αρχεία της πόλης, και καμιά ντουζίνα πολίτες είχαν σχηματίσει μια αλυσίδα για να μεταφέρουν τα κουτιά σε ψηλότερο έδαφος. Αυτή ήταν η πόλη στα καλύτερά της, είπε, άνθρωποι που κουβαλούσαν το παρελθόν στην ασφάλεια με τα χέρια τους, και το σκεφτόταν αυτό στις άσχημες νύχτες.</w:t>
       </w:r>
     </w:p>
     <w:p>
@@ -2827,7 +2827,7 @@
     <w:p/>
     <w:p>
       <w:r>
-        <w:t xml:space="preserve">Κάθισα μ’ αυτό όπως είχα κάτσει με τα είκοσι δολάρια του Σαμ. Εδώ ήταν ένας άντρας χωμένος βαθιά στα χρέη, με κάθε λόγο στον κόσμο και κάθε ευκαιρία επιπλέον. Η απάντησή του σ’ αυτό ήταν να στέκεται φρουρός στο φεστιβάλ της πόλης όλη τη νύχτα έναντι αμοιβής και να μαθαίνει σε γιαγιάδες να κάνουν προβολές στις πέντε και μισή το πρωί. Ο Τζαμάλ δούλευε τρεις δουλειές για να σκαρφαλώσει έξω από την τρύπα του με τον τίμιο, εξαντλητικό, εκατοστό προς εκατοστό τρόπο, και αυτό δεν ταίριαζε με ένα σημείωμα εκβιασμού για μισό εκατομμύριο δολάρια. Η αριθμητική δεν έβγαινε. Αν ο Τζαμάλ Γουάσινγκτον είχε τον παραμικρό τρόπο να ξετρυπώσει αυτού του είδους τα χρήματα από ένα μυστικό, δεν θα έβαζε το ξυπνητήρι του στις πέντε.</w:t>
+        <w:t xml:space="preserve">Το ζύγισα όπως είχα ζυγίσει τα είκοσι δολάρια του Σαμ. Εδώ ήταν ένας άντρας χωμένος βαθιά στα χρέη, με κάθε λόγο στον κόσμο και κάθε ευκαιρία επιπλέον. Η απάντησή του σ’ αυτό ήταν να στέκεται φρουρός στο φεστιβάλ της πόλης όλη τη νύχτα έναντι αμοιβής και να μαθαίνει σε γιαγιάδες να κάνουν προβολές στις πέντε και μισή το πρωί. Ο Τζαμάλ δούλευε τρεις δουλειές για να σκαρφαλώσει έξω από την τρύπα του με τον τίμιο, εξαντλητικό, εκατοστό προς εκατοστό τρόπο, και αυτό δεν ταίριαζε με ένα σημείωμα εκβιασμού για μισό εκατομμύριο δολάρια. Η αριθμητική δεν έβγαινε. Αν ο Τζαμάλ Γουάσινγκτον είχε τον παραμικρό τρόπο να ξετρυπώσει αυτού του είδους τα χρήματα από ένα μυστικό, δεν θα έβαζε το ξυπνητήρι του στις πέντε.</w:t>
       </w:r>
     </w:p>
     <w:p/>
@@ -2851,7 +2851,7 @@
     <w:p/>
     <w:p>
       <w:r>
-        <w:t>Το είπε ανάλαφρα, χωρίς καμία ιδέα ότι μου είχε παραδώσει οτιδήποτε απολύτως, και κράτησα το πρόσωπό μου ανέκφραστο πάνω από το μικρό, καθαρό κλικ που έκανε μέσα μου. Δεν είχε διαβάσει τα γράμματα. Είχε κουβαλήσει τα κουτιά με τα μάτια του καρφωμένα στα πόδια του. Ό,τι κι αν είχε διαβάσει ο εκβιαστής στα χαρτιά των Μπλάκμπερν, την καρφίτσα, την πέτρα, το ενεχυροδανειστήριο, ο Τζαμάλ δεν την είχε ποτέ μπροστά στα μάτια του. Την είχε στην αγκαλιά του, κλεισμένη σ’ ένα κουτί, και ποτέ δεν είχε κοιτάξει μέσα.</w:t>
+        <w:t xml:space="preserve">Το είπε ανάλαφρα, χωρίς καμία ιδέα ότι μου είχε παραδώσει οτιδήποτε απολύτως, και κράτησα το πρόσωπό μου ανέκφραστο πάνω από το μικρό, καθαρό κλικ που έκανε μέσα μου. Δεν είχε διαβάσει τα γράμματα. Είχε κουβαλήσει τα κουτιά με τα μάτια του καρφωμένα στα πόδια του. Ό,τι κι αν είχε διαβάσει ο εκβιαστής στα χαρτιά των Μπλάκμπερν, την καρφίτσα, την πέτρα, το ενεχυροδανειστήριο, ο Τζαμάλ δεν το είχε ποτέ μπροστά στα μάτια του. Το είχε στην αγκαλιά του, κλεισμένη σ’ ένα κουτί, και ποτέ δεν είχε κοιτάξει μέσα.</w:t>
       </w:r>
     </w:p>
     <w:p/>
@@ -2887,7 +2887,7 @@
     <w:p/>
     <w:p>
       <w:r>
-        <w:t>Και με ανησύχησε, επειδή κάθε όνομα που έβγαζα από τη μέση έκανε τη λίστα μικρότερη. Περπατώντας σπίτι μέσα στο χρυσοφώτιστο κρύο, μπορούσα να δω ακριβώς πού άρχισε να δείχνει η μικρή λίστα, και η κατεύθυνση δεν μου άρεσε καθόλου.</w:t>
+        <w:t xml:space="preserve">Και με ανησύχησε, επειδή κάθε όνομα που έβγαζα από τη μέση έκανε τη λίστα μικρότερη. Περπατώντας σπίτι μέσα στο χρυσοφώτιστο κρύο, μπορούσα να δω ακριβώς πού άρχιζε να δείχνει η μικρή λίστα, και η κατεύθυνση δεν μου άρεσε καθόλου.</w:t>
       </w:r>
     </w:p>
     <w:p>
@@ -3005,7 +3005,7 @@
     </w:p>
     <w:p>
       <w:r>
-        <w:t xml:space="preserve">«Κατευθύνεται προς το εργαστήριο», είπε ο Μπραμ, τινάζοντας τα φύλλα από τα γόνατά του. «Όλοι θέλουν το εργαστήριο τώρα. Γιατί το θέλουν όλοι το εργαστήριο, κυρία Κλος; Τι έχει μέσα σ' αυτόν τον χώρο;»</w:t>
+        <w:t xml:space="preserve">«Κατευθύνεται προς το εργαστήριο», είπε ο Μπραμ, τινάζοντας τα φύλλα από τα γόνατά του. «Όλοι θέλουν το εργαστήριο τώρα. Γιατί το θέλουν όλοι το εργαστήριο, κυρία Κλος; Τι έχει βάλει εκεί μέσα;»</w:t>
       </w:r>
     </w:p>
     <w:p>
@@ -3072,7 +3072,7 @@
     <w:p/>
     <w:p>
       <w:r>
-        <w:t xml:space="preserve">Η Πιπ κι εγώ φτάσαμε τελευταίες. Ο κύκλος είχε τραβήξει τις καρέκλες του κοντά στη σόμπα ξύλου, με καλάθια γεμάτα μαλλί στο πράσινο του σχολείου στο πάτωμα ανάμεσά τους. Τα τελειωμένα γάντια κρέμονταν κατά ζευγάρια πάνω από έναν σπάγκο κατά μήκος του πάγκου, σαν μπουγάδα. Η Πιπ κατευθύνθηκε ευθεία στο βάζο με τα κουμπιά στο χαμηλό ράφι δίπλα στο ταμείο, και η Ολίβια το μετακίνησε στην κορυφή του πάγκου χωρίς να χάσει ούτε θηλιά.</w:t>
+        <w:t xml:space="preserve">Η Πιπ κι εγώ φτάσαμε τελευταίες. Ο κύκλος είχε τραβήξει τις καρέκλες του κοντά στη σόμπα ξύλου, με καλάθια γεμάτα μαλλί στο πράσινο του σχολείου στο πάτωμα ανάμεσά τους. Τα τελειωμένα γάντια κρέμονταν κατά ζευγάρια σε έναν σπάγκο πάνω από τον πάγκο, σαν μπουγάδα. Η Πιπ κατευθύνθηκε ευθεία στο βάζο με τα κουμπιά στο χαμηλό ράφι δίπλα στο ταμείο, και η Ολίβια το μετακίνησε στην κορυφή του πάγκου χωρίς να χάσει ούτε θηλιά.</w:t>
       </w:r>
     </w:p>
     <w:p/>
@@ -3299,7 +3299,7 @@
     <w:p/>
     <w:p>
       <w:r>
-        <w:t xml:space="preserve">«Ο Τζαμάλ μετέφερε τα κουτιά αλλά δεν άνοιξε ποτέ κανένα», είπα. «Μου το είπε ο ίδιος, και τον πιστεύω. Ολόκληρη η ακαδημαϊκή του πορεία στην ιστορία βασιζόταν στη φράση “προσοχή, αυτό είναι πολύτιμο”. Είχε τα χέρια του απ’ έξω από το μυστικό όλη την εβδομάδα και δεν κοίταξε ποτέ μέσα. Και ο άνθρωπος δουλεύει σε τρεις δουλειές για να βγει από το αδιέξοδό του με τον τίμιο τρόπο, και τη στρατιωτική γυμναστική στις πεντέμισι και τη νυχτερινή φύλαξη. Δεν είναι αυτός». Τράβηξα μια γραμμή πάνω από το όνομα του Τζαμάλ, σταθερή. «Είχε την ευκαιρία αλλά όχι τη γνώση. Και ούτε την ψυχή γι' αυτό, πράγμα που μετράει για μένα ακόμα κι αν δεν θα στεκόταν σε δικαστήριο».</w:t>
+        <w:t xml:space="preserve">«Ο Τζαμάλ μετέφερε τα κουτιά αλλά δεν άνοιξε ποτέ κανένα», είπα. «Μου το είπε ο ίδιος, και τον πιστεύω. Ολόκληρη η ακαδημαϊκή του πορεία στην ιστορία βασιζόταν στη φράση “προσοχή, αυτό είναι πολύτιμο”. Είχε τα χέρια του απ’ έξω από το μυστικό όλη την εβδομάδα και δεν κοίταξε ποτέ μέσα. Και ο άνθρωπος δουλεύει σε τρεις δουλειές για να βγει από το αδιέξοδό του με τον τίμιο τρόπο, και τη στρατιωτική γυμναστική στις πεντέμισι και τη νυχτερινή φύλαξη. Δεν είναι αυτός». Τράβηξα μια γραμμή πάνω στο όνομα του Τζαμάλ, σταθερή. «Είχε την ευκαιρία αλλά όχι τη γνώση. Και ούτε την ψυχή γι' αυτό, πράγμα που μετράει για μένα ακόμα κι αν δεν θα στεκόταν σε δικαστήριο».</w:t>
       </w:r>
     </w:p>
     <w:p/>
@@ -3556,7 +3556,7 @@
     <w:p/>
     <w:p>
       <w:r>
-        <w:t xml:space="preserve">Κι εκεί ήταν, η τελευταία απόδειξη, παρόλο που είχα έρθει για να ζητήσω συγγνώμη και όχι για να βρω αποδείξεις. Αν ο Σαμ Πάτελ είχε γράψει αυτά τα σημειώματα, δεν θα στεκόταν στην κρύα βεράντα της Φιόνας με ένα αλφάδι στο χέρι προσφέροντας, χλωμός από την αγωνία, να με βοηθήσει να τον πιάσω. Ολόκληρη η θεωρία κατέρρευσε τη στιγμή που είδες το πρόσωπό του.</w:t>
+        <w:t xml:space="preserve">Κι εκεί ήταν, η τελευταία απόδειξη, παρόλο που είχα έρθει για να ζητήσω συγγνώμη και όχι για να βρω αποδείξεις. Αν ο Σαμ Πάτελ είχε γράψει αυτά τα σημειώματα, δεν θα στεκόταν στην κρύα βεράντα της Φιόνας με ένα αλφάδι στο χέρι προσφέροντας, χλωμός από την αγωνία, να με βοηθήσει να πιάσω τον ίδιο του τον εαυτό. Ολόκληρη η θεωρία κατέρρευσε τη στιγμή που είδες το πρόσωπό του.</w:t>
       </w:r>
     </w:p>
     <w:p/>
@@ -3603,7 +3603,7 @@
     <w:p/>
     <w:p>
       <w:r>
-        <w:t xml:space="preserve">«Υπαρκτό γραφείο», είπε, πριν προλάβω καν να πω ένα γεια. «Παλιό, δύο πολιτείες πιο πέρα, κάνει ό,τι λέει ο άνθρωπός σου ότι κάνει: διαθήκες, κληρονομιές και εντοπισμό χαμένης περιουσίας για δικηγόρους που έχουν περισσότερα χρήματα παρά χρόνο. Και υπάρχει μια περιουσία των Μπλάκμπερν, Τζέσικα, μια αληθινή, τρέχουσα. Ο τελευταίος της γενιάς της Αδελαΐδας Μπλάκμπερν πέθανε στην πόλη αυτή την άνοιξη, χωρίς παιδιά, χωρίς αξιόλογη διαθήκη, και άφησε ένα τεράστιο μπέρδεμα. Ο δήμαρχός μας είναι από την πλευρά των ξαδέλφων, από την πλευρά που πήρε τη μύτη αλλά καθόλου τα χρήματα. Αυτός δεν αναφέρεται πουθενά. Ο Κάρτερ είναι καταγεγραμμένος στα βιβλία του γραφείου ως ο ερευνητής που προσέλαβαν για να ξεψαχνίσει την υπόθεση. Το έμαθα από μια υπάλληλο που επιβεβαίωσε τα πάντα χωρίς ούτε μια στιγμή να καταλάβει ότι επιβεβαίωνε κάτι. Είναι ακριβώς, απολύτως αυτός που σου είπε ότι είναι. Ένας σπιούνος με άδεια και λογαριασμό εξόδων».</w:t>
+        <w:t xml:space="preserve">«Υπαρκτό γραφείο», είπε, πριν προλάβω καν να πω ένα γεια. «Παλιό, δύο πολιτείες πιο πέρα, κάνει ό,τι λέει ότι κάνει ο Κάρτερ σου: διαθήκες, κληρονομιές και εντοπισμό χαμένης περιουσίας για δικηγόρους που έχουν περισσότερα χρήματα παρά χρόνο. Και υπάρχει μια περιουσία των Μπλάκμπερν, Τζέσικα, μια αληθινή, τρέχουσα. Ο τελευταίος της γενιάς της Αδελαΐδας Μπλάκμπερν πέθανε στη μεγαλούπολη αυτή την άνοιξη, χωρίς παιδιά, χωρίς αξιόλογη διαθήκη, και άφησε ένα τεράστιο μπέρδεμα. Ο δήμαρχός μας είναι από την πλευρά των ξαδέλφων, από την πλευρά που πήρε τη μύτη αλλά καθόλου τα χρήματα. Αυτός δεν αναφέρεται πουθενά. Ο Κάρτερ είναι καταγεγραμμένος στα βιβλία του γραφείου ως ο ερευνητής που προσέλαβαν για να ξεψαχνίσει την υπόθεση. Το έμαθα από μια υπάλληλο που επιβεβαίωσε τα πάντα χωρίς ούτε μια στιγμή να καταλάβει ότι επιβεβαίωνε κάτι. Είναι ακριβώς, απολύτως αυτός που σου είπε ότι είναι. Ένας σπιούνος με άδεια και λογαριασμό εξόδων».</w:t>
       </w:r>
     </w:p>
     <w:p/>
@@ -3729,7 +3729,7 @@
     <w:p/>
     <w:p>
       <w:r>
-        <w:t xml:space="preserve">«Δεν λέω ότι είχε δίκιο που την πήρε. Λέω ότι δεν ήταν κλέφτρα με τον απλό τρόπο που το σημείωμα θέλει να πιστεύει η φίλη σας. Ήταν ένα απελπισμένο κορίτσι, ληστεμένο πρώτα από πλούσιους ανθρώπους που είχαν την οικονομική δυνατότητα να την πληρώσουν και επέλεξαν να μην το κάνουν. Πλήρωσε τον εαυτό της πίσω με το μόνο πράγμα που μπορούσε να φτάσει, και έχτισε πάνω σε αυτό εκατό χρόνια ειλικρινούς φιλοξενίας. Υπάρχουν χειρότερα θεμέλια για ένα πανδοχείο».</w:t>
+        <w:t xml:space="preserve">«Δεν λέω ότι είχε δίκιο που την πήρε. Λέω ότι δεν ήταν κλέφτρα με τον απλό τρόπο που το σημείωμα θέλει να πιστεύει η φίλη σας. Ήταν ένα απελπισμένο κορίτσι, ληστεμένο πρώτα από πλούσιους ανθρώπους που είχαν την οικονομική δυνατότητα να την πληρώσουν και επέλεξαν να μην το κάνουν. Αποζημίωσε τον εαυτό της με το μόνο πράγμα που μπορούσε να φτάσει, και έχτισε πάνω σε αυτό εκατό χρόνια ειλικρινούς φιλοξενίας. Υπάρχουν χειρότερα θεμέλια για ένα πανδοχείο».</w:t>
       </w:r>
     </w:p>
     <w:p/>
@@ -3938,7 +3938,7 @@
     <w:p/>
     <w:p>
       <w:r>
-        <w:t xml:space="preserve">Στο κέντρο του δωματίου, εκεί όπου θα στεκόταν η παλιά εστία του Πόλου, είχε χτίσει ένα μεγάλο τζάκι από αγροτόπετρες, στρογγυλές πέτρες του ποταμού τοποθετημένες με το χέρι η μία πάνω στην άλλη. Δεν υπήρχε φωτιά μέσα του. Η σχάρα στεκόταν κρύα και άδεια, κι όμως έφεγγε. Το ζεστό χρυσό φως ανάβλυζε από την ίδια την ακατέργαστη πέτρα. Η άστεγη μαγεία που πήγαινε πόρτα-πόρτα σε ολόκληρο το Φροστ Φολς είχε έρθει, ένα μέρος της, εδώ, και έκανε αργούς κύκλους στον ζεστό αέρα πάνω από την άδεια εστία, σαν ένα κουρασμένο πλάσμα που επιτέλους βρήκε ένα μέρος όπου θα μπορούσε, κάποια μέρα, να του επιτραπεί να ξαπλώσει.</w:t>
+        <w:t xml:space="preserve">Στο κέντρο του δωματίου, εκεί όπου θα στεκόταν η παλιά εστία του Πόλου, είχε χτίσει ένα μεγάλο τζάκι από πέτρες των χωραφιών, στρογγυλές πέτρες του ποταμού τοποθετημένες με το χέρι η μία πάνω στην άλλη. Δεν υπήρχε φωτιά μέσα του. Η σχάρα στεκόταν κρύα και άδεια, κι όμως έφεγγε. Το ζεστό χρυσό φως ανάβλυζε από την ίδια την ακατέργαστη πέτρα. Η άστεγη μαγεία που πήγαινε πόρτα-πόρτα σε ολόκληρο το Φροστ Φολς είχε έρθει, ένα μέρος της, εδώ, και έκανε αργούς κύκλους στον ζεστό αέρα πάνω από την άδεια εστία, σαν ένα κουρασμένο πλάσμα που επιτέλους βρήκε ένα μέρος όπου θα μπορούσε, κάποια μέρα, να του επιτραπεί να ξαπλώσει.</w:t>
       </w:r>
     </w:p>
     <w:p/>
@@ -3950,13 +3950,13 @@
     <w:p/>
     <w:p>
       <w:r>
-        <w:t xml:space="preserve">«Μια εστία». Το χέρι του τυλίχθηκε γύρω μου. «Δεν έχει τελειώσει. Δεν μπορεί να το κρατήσει ακόμα, όχι ολόκληρο, όχι για πάντα. Αυτά είναι χρόνια δουλειάς, Τζες. Αλλά είναι μια αρχή. Ένα μέρος για να έρθει. Έτσι ώστε να σταματήσει να κυνηγάει το σκοτάδι». Με κοίταξε, με το χρυσό φως να κινείται στο πρόσωπό του. «Ήθελα να το δεις απόψε επειδή κουβαλάς κάτι φρικτό, και δεν ήθελα να περιπλανιέσαι σκεπτόμενη ότι ολόκληρος ο κόσμος είναι μόνο άνθρωποι που κάνουν κακό στο σκοτάδι. Κάποιοι από εμάς είναι έξω στο σκοτάδι επίσης, χτίζοντας μέρη για να προσγειωθεί η ζεστασιά».</w:t>
-      </w:r>
-    </w:p>
-    <w:p/>
-    <w:p>
-      <w:r>
-        <w:t xml:space="preserve">Στάθηκα στη λάμψη της φωτιάς που δεν είχε ανάψει και άφησα τον εαυτό μου να κλάψει, επιτέλους, λίγο, για τον Θίο, για τη Φιόνα και για όλο αυτό το φρικτό, μπερδεμένο χάος. Ο Νικ με κράτησε σφιχτά. Από πάνω μας η μαγεία έκανε τους αργούς χρυσούς κύκλους της, κυνηγώντας σπίτι, και μόλις τώρα αρχίζοντας να το βρίσκει.</w:t>
+        <w:t xml:space="preserve">«Μια εστία». Το χέρι του τυλίχθηκε γύρω μου. «Δεν έχει τελειώσει. Δεν μπορεί να το κρατήσει ακόμα, όχι ολόκληρο, όχι για πάντα. Αυτά είναι χρόνια δουλειάς, Τζες. Αλλά είναι μια αρχή. Ένα μέρος για να έρθει. Έτσι ώστε να σταματήσει να ψάχνει μέσα στο σκοτάδι». Με κοίταξε, με το χρυσό φως να κινείται στο πρόσωπό του. «Ήθελα να το δεις απόψε επειδή κουβαλάς κάτι φρικτό, και δεν ήθελα να περιπλανιέσαι σκεπτόμενη ότι ολόκληρος ο κόσμος είναι μόνο άνθρωποι που κάνουν κακό στο σκοτάδι. Κάποιοι από εμάς είναι έξω στο σκοτάδι επίσης, χτίζοντας μέρη για να προσγειωθεί η ζεστασιά».</w:t>
+      </w:r>
+    </w:p>
+    <w:p/>
+    <w:p>
+      <w:r>
+        <w:t xml:space="preserve">Στάθηκα στη λάμψη της φωτιάς που δεν είχε ανάψει και άφησα τον εαυτό μου να κλάψει, επιτέλους, λίγο, για τον Θίο, για τη Φιόνα και για όλο αυτό το φρικτό, μπερδεμένο χάος. Ο Νικ με κράτησε σφιχτά. Από πάνω μας η μαγεία έκανε τους αργούς χρυσούς κύκλους της, ψάχνοντας για σπίτι, και μόλις τώρα αρχίζοντας να το βρίσκει.</w:t>
       </w:r>
     </w:p>
     <w:p/>
@@ -4051,7 +4051,7 @@
     <w:p/>
     <w:p>
       <w:r>
-        <w:t xml:space="preserve">«Όχι», είπα, γυρίζοντας το σημείωμα στα χέρια μου, διαβάζοντάς το ξανά. «Θέλει να σε τρομάξει αρκετά ώστε να βρεις κάτι που δεν υπάρχει. Οι άνθρωποι που δεν υπήρξαν ποτέ πραγματικά σε απόγνωση πιστεύουν ότι οι απεγνωσμένοι μπορούν πάντα να ξετρυπώσουν χρήματα με κάποιον τρόπο, φτάνει να τους στριμώξεις αρκετά. Νομίζει ότι υπάρχει κάποιος πλούσιος συγγενής που ντρεπόσουν να του ζητήσεις. Νομίζει ότι θα πουλήσεις κάτι, θα υποθηκεύσεις κάτι, θα πας στους Γούορθινγκτον στα τέσσερα. Πιστεύει ότι ο ίδιος ο φόβος θα κάνει τα χρήματα να πέσουν, σαν κέρματα από μια τσέπη που την αναποδογυρίζεις». Την κοίταξα. «Και αυτό μου λέει κάτι για εκείνον, Φιόνα, είτε είχε σκοπό να το δείξει είτε όχι. Μου λέει ότι βρίσκεται κι εκείνος σε απόγνωση. Οι άνετοι άνθρωποι δεν φαντάζονται ότι τα χρήματα εμφανίζονται υπό πίεση, επειδή τα χρήματα δεν χρειάστηκε ποτέ να εμφανιστούν γι' αυτούς, απλώς ήταν πάντα εκεί. Μόνο κάποιος που χρειάστηκε να τα κάνει να εμφανιστούν, κάπως, σε έναν δύσκολο μήνα, σκέφτεται έτσι. Το σημείωμα με έχει τρομάξει για χάρη σου εδώ και μέρες. Τώρα μόλις μου πέρασε από το μυαλό να τρομάξω λίγο και για εκείνον, όποιος κι αν είναι».</w:t>
+        <w:t xml:space="preserve">«Όχι», είπα, γυρίζοντας το σημείωμα στα χέρια μου, διαβάζοντάς το ξανά. «Θέλει να σε τρομάξει αρκετά ώστε να βρεις κάτι που δεν υπάρχει. Οι άνθρωποι που δεν υπήρξαν ποτέ πραγματικά σε απόγνωση πιστεύουν ότι οι απεγνωσμένοι μπορούν πάντα να ξετρυπώσουν χρήματα με κάποιον τρόπο, φτάνει να τους στριμώξεις αρκετά. Νομίζει ότι υπάρχει κάποιος πλούσιος συγγενής που ντρεπόσουν να του ζητήσεις. Νομίζει ότι θα πουλήσεις κάτι, θα υποθηκεύσεις κάτι, θα πας γονατιστή στους Γούορθινγκτον. Πιστεύει ότι ο ίδιος ο φόβος θα κάνει τα χρήματα να πέσουν, σαν κέρματα από μια τσέπη που την αναποδογυρίζεις». Την κοίταξα. «Και αυτό μου λέει κάτι για εκείνον, Φιόνα, είτε είχε σκοπό να το δείξει είτε όχι. Μου λέει ότι βρίσκεται κι εκείνος σε απόγνωση. Οι εύποροι άνθρωποι δεν φαντάζονται ότι τα χρήματα εμφανίζονται υπό πίεση, επειδή τα χρήματα δεν χρειάστηκε ποτέ να εμφανιστούν γι' αυτούς, απλώς ήταν πάντα εκεί. Μόνο κάποιος που χρειάστηκε να τα κάνει να εμφανιστούν, κάπως, σε έναν δύσκολο μήνα, σκέφτεται έτσι. Το σημείωμα με έχει τρομάξει για χάρη σου εδώ και μέρες. Τώρα μόλις μου πέρασε από το μυαλό να τρομάξω λίγο και για εκείνον, όποιος κι αν είναι».</w:t>
       </w:r>
     </w:p>
     <w:p/>
@@ -4150,7 +4150,7 @@
     </w:p>
     <w:p>
       <w:r>
-        <w:t xml:space="preserve">Η Πιπ ήταν μια αληθινή αίσθηση. Το ήξερα ότι θα ήταν. Η Φιόνα είχε στήσει μια γωνιά στη βεράντα του πανδοχείου σαν φωτογραφικό θάλαμο, μια καρέκλα, ένα βαμμένο χειμωνιάτικο σκηνικό και ένα καλάθι με πλεκτά κασκόλ, και με ένα δολάριο για την Ιστορική Εταιρεία μπορούσες να βγάλεις φωτογραφία σου με τον ίδιο τον πιγκουίνο του Βόρειου Πόλου. Η ουρά έφτανε σε όλο το μήκος της βεράντας και κάτω στα σκαλιά όλο το απόγευμα. Η Πιπ φορούσε διαφορετικό κασκόλ για κάθε φωτογραφία και δεχόταν τη λατρεία σαν αρχαίο της δικαίωμα. Αρνιόταν, με μεγάλη αξιοπρέπεια, κάθε κομμάτι μπισκότου που τα παιδιά προσπαθούσαν να της γλιστρήσουν κάτω από το τραπέζι. Τα χαρτονομίσματα του δολαρίου σωρεύονταν στο βάζο, και ήταν τα πρώτα χρήματα που είχε μαζέψει η Εταιρεία από το κουτί εισπράξεων της Ολίβιας. Δεν επρόκειτο να τους σώσει αυτό. Ένα βάζο με χαρτονομίσματα δολαρίων δεν μπορούσε να σώσει ένα κτίριο. Ήταν όμως κάτι, και ήταν ζεστό. Η Φιόνα στεκόταν δίπλα στο θάλαμο παίρνοντας τα δολάρια και χαμογελώντας με αληθινό χαμόγελο, και για ένα απόγευμα ήταν και πάλι ο εαυτός της.</w:t>
+        <w:t xml:space="preserve">Η Πιπ ήταν μια αληθινή αίσθηση. Το ήξερα ότι θα ήταν. Η Φιόνα είχε στήσει μια γωνιά στη βεράντα του πανδοχείου σαν φωτογραφικό θάλαμο, μια καρέκλα, ένα βαμμένο χειμωνιάτικο σκηνικό και ένα καλάθι με πλεκτά κασκόλ, και με ένα δολάριο για την Ιστορική Εταιρεία μπορούσες να βγάλεις φωτογραφία σου με τον ίδιο τον πιγκουίνο του Βόρειου Πόλου. Η ουρά έφτανε σε όλο το μήκος της βεράντας και κάτω στα σκαλιά όλο το απόγευμα. Η Πιπ φορούσε διαφορετικό κασκόλ για κάθε φωτογραφία και δεχόταν τη λατρεία σαν αρχαίο της δικαίωμα. Αρνιόταν, με μεγάλη αξιοπρέπεια, κάθε κομμάτι μπισκότου που τα παιδιά προσπαθούσαν να της γλιστρήσουν κάτω από το τραπέζι. Τα χαρτονομίσματα του δολαρίου σωρεύονταν στο βάζο, και ήταν τα πρώτα χρήματα που είχε μαζέψει η Εταιρεία από την εποχή του κουτιού εισπράξεων της Ολίβιας. Δεν επρόκειτο να τους σώσει αυτό. Ένα βάζο με χαρτονομίσματα δολαρίων δεν μπορούσε να σώσει ένα κτίριο. Ήταν όμως κάτι, και ήταν ζεστό. Η Φιόνα στεκόταν δίπλα στο θάλαμο παίρνοντας τα δολάρια και χαμογελώντας με αληθινό χαμόγελο, και για ένα απόγευμα ήταν και πάλι ο εαυτός της.</w:t>
       </w:r>
     </w:p>
     <w:p>
@@ -4160,12 +4160,12 @@
     </w:p>
     <w:p>
       <w:r>
-        <w:t xml:space="preserve">Στο ένα επίπεδο ήμουν εκεί, μια γυναίκα της πόλης στο φεστιβάλ της, και ήταν υπέροχα. Η Έμα Ρέντφερν με βρήκε κοντά στον χυμό μήλου και επέδειξε τη στολή της, την οποία επέμενε να φορέσει μια μέρα νωρίτερα: έναν αστερισμό, τον Ωρίωνα, μαύρο με ασημένια αστέρια ραμμένα στις σωστές τους θέσεις από το προσεκτικό χέρι του πατέρα της, με τη ζώνη απολύτως σωστή. Με έβαλε να ονομάσω κάθε αστέρι, και το έκανα, επειδή γνώριζα αυτά τα αστέρια εδώ και πολύ καιρό. Είχε ενθουσιαστεί που η κυρία Κλος γνώριζε τους αστερισμούς της. Ο Μαρκ στεκόταν κοντά με δύο κούπες χυμό μήλου και την ξεφτισμένη από τη χρήση έκφραση ενός άντρα που παρακολουθεί την κόρη του να γίνεται οκτώ χρονών φωναχτά μέσα σε πλήθος. Η Μάρθα μου φόρεσε με το ζόρι ένα ζευγάρι γάντια από το τραπέζι, τα πράσινα, «για αυτά τα παγωμένα σου χέρια». Ο Σαμ Πάτελ σήκωσε ελαφρά το καπέλο του από απέναντι, από το πόστο του κοντά στη βεράντα του πανδοχείου, όπου είχε εγκατασταθεί όλη μέρα με τα μάτια του καρφωμένα στη ρεσεψιόν ακριβώς μέσα από την πόρτα, όπως του είχα ζητήσει.</w:t>
-      </w:r>
-    </w:p>
-    <w:p>
-      <w:r>
-        <w:t>Και στο άλλο επίπεδο, κάτω από όλη τη ζεστασιά, παρατηρούσα κι εγώ. Το δεύτερο σημείωμα έλεγε ότι το φεστιβάλ τελειώνει την Κυριακή, και ο εκβιαστής ήταν εδώ, κάπου, μέσα σε αυτό το πλήθος, σε ένα από αυτά τα γελαστά πρόσωπα. Δεν μπορούσα να σταματήσω να κοιτάζω την πόρτα του πανδοχείου και τη ρεσεψιόν ακριβώς μέσα, όπου ένα τρίτο σημείωμα θα μπορούσε να έχει αφεθεί ανάμεσα στο πλήθος του φεστιβάλ.</w:t>
+        <w:t xml:space="preserve">Στο ένα επίπεδο ήμουν εκεί, μια γυναίκα της πόλης στο φεστιβάλ της, και ήταν υπέροχα. Η Έμα Ρέντφερν με βρήκε κοντά στον χυμό μήλου και επέδειξε τη στολή της, την οποία επέμενε να φορέσει μια μέρα νωρίτερα: έναν αστερισμό, τον Ωρίωνα, μαύρο με ασημένια αστέρια ραμμένα στις σωστές τους θέσεις από το προσεκτικό χέρι του πατέρα της, με τη ζώνη απολύτως σωστή. Με έβαλε να ονομάσω κάθε αστέρι, και το έκανα, επειδή γνώριζα αυτά τα αστέρια εδώ και πολύ καιρό. Είχε ενθουσιαστεί που η κυρία Κλος γνώριζε τους αστερισμούς της. Ο Μαρκ στεκόταν κοντά με δύο κούπες χυμό μήλου και την ήρεμη, γαληνεμένη έκφραση ενός άντρα που παρακολουθεί την κόρη του να γίνεται οκτώ χρονών φωναχτά μέσα σε πλήθος. Η Μάρθα επέμεινε να μου δώσει ένα ζευγάρι γάντια από το τραπέζι, τα πράσινα, «για αυτά τα παγωμένα σου χέρια». Ο Σαμ Πάτελ σήκωσε ελαφρά το καπέλο του από απέναντι, από το πόστο του κοντά στη βεράντα του πανδοχείου, όπου είχε εγκατασταθεί όλη μέρα με τα μάτια του καρφωμένα στη ρεσεψιόν ακριβώς μέσα από την πόρτα, όπως του είχα ζητήσει.</w:t>
+      </w:r>
+    </w:p>
+    <w:p>
+      <w:r>
+        <w:t xml:space="preserve">Και στο άλλο επίπεδο, κάτω από όλη τη ζεστασιά, παρατηρούσα κι εγώ. Το δεύτερο σημείωμα έλεγε ότι το φεστιβάλ τελειώνει την Κυριακή, και ο εκβιαστής ήταν εδώ, κάπου, μέσα σε αυτό το πλήθος, σε ένα από αυτά τα γελαστά πρόσωπα. Δεν μπορούσα να σταματήσω να κοιτάζω την πόρτα του πανδοχείου και τη ρεσεψιόν ακριβώς μέσα, όπου ένα τρίτο σημείωμα θα μπορούσε να αφεθεί ανάμεσα στο πλήθος του φεστιβάλ.</w:t>
       </w:r>
     </w:p>
     <w:p>
@@ -4185,7 +4185,7 @@
     </w:p>
     <w:p>
       <w:r>
-        <w:t xml:space="preserve">«Νόμιζα ότι ήταν κάποια άλλη».</w:t>
+        <w:t xml:space="preserve">«Νόμιζα ότι ήταν κάποιος άλλος».</w:t>
       </w:r>
     </w:p>
     <w:p>
@@ -4295,7 +4295,7 @@
     </w:p>
     <w:p>
       <w:r>
-        <w:t>Έκλαψα λίγο, καθισμένη εκεί στο τραπέζι της κουζίνας. Ένας καλός άνθρωπος είχε κάνει μια φρικτή πράξη, και δεν επρόκειτο να το αντιμετωπίσω αυτό αδιάφορα.</w:t>
+        <w:t xml:space="preserve">Έκλαψα λίγο, καθισμένη εκεί στο τραπέζι της κουζίνας. Ένας καλός άνθρωπος είχε κάνει μια φρικτή πράξη, και δεν επρόκειτο να το αντικρίσω με στεγνά μάτια.</w:t>
       </w:r>
     </w:p>
     <w:p>
@@ -4324,7 +4324,7 @@
     </w:p>
     <w:p>
       <w:r>
-        <w:t xml:space="preserve">Κάθισα ακίνητη στο φως της λάμπας. Η κλοπή της καρφίτσας και η αγορά του πανδοχείου ήταν δύο διαφορετικά μυστικά, φυλαγμένα σε δύο διαφορετικά κτίρια. Ο Θίο είχε το ένα από αυτά. Είχε το αρχείο, τα γράμματα, το δελτίο καταλόγου, τα επιστολόχαρτα. Είχε την κλοπή. Αλλά η απόδειξη ότι τα κλεμμένα χρήματα είχαν μετατραπεί σε αυτό το πολυαγαπημένο πανδοχείο βρισκόταν στο Δημαρχείο, στα αρχεία ιδιοκτησίας που μια άκαμπτη, κουρασμένη γυναίκα με είχε κοιτάξει στα μάτια και είχε ορκιστεί ότι δεν διάβαζε ποτέ.</w:t>
+        <w:t xml:space="preserve">Κάθισα ακίνητη στο φως της λάμπας. Η κλοπή της καρφίτσας και η αγορά του πανδοχείου ήταν δύο διαφορετικά μυστικά, φυλαγμένα σε δύο διαφορετικά κτίρια. Ο Θίο είχε το ένα από αυτά. Είχε το αρχείο, τα γράμματα, το δελτίο καταλόγου, τα επιστολόχαρτα. Είχε το μυστικό της κλοπής. Αλλά η απόδειξη ότι τα κλεμμένα χρήματα είχαν μετατραπεί σε αυτό το πολυαγαπημένο πανδοχείο βρισκόταν στο Δημαρχείο, στα αρχεία ιδιοκτησίας που μια άκαμπτη, κουρασμένη γυναίκα με είχε κοιτάξει στα μάτια και είχε ορκιστεί ότι δεν διάβαζε ποτέ.</w:t>
       </w:r>
     </w:p>
     <w:p>
@@ -4405,7 +4405,7 @@
     <w:p/>
     <w:p>
       <w:r>
-        <w:t xml:space="preserve">Το συμβόλαιο του πανδοχείου. Έξω από το συρτάρι του. Να κάθεται στο καλάθι επαναρχειοθέτησης, πρόσφατα πιασμένο στα χέρια, πάνω στο γραφείο μιας γυναίκας που με είχε κοιτάξει κατάματα και μου είχε πει, δύο φορές, ότι ποτέ της δεν διάβαζε τα αρχεία στην πλάτη της.</w:t>
+        <w:t xml:space="preserve">Το συμβόλαιο του πανδοχείου. Έξω από το συρτάρι του. Να κάθεται στο καλάθι επαναρχειοθέτησης, πρόσφατα πιασμένο στα χέρια, πάνω στο γραφείο μιας γυναίκας που με είχε κοιτάξει κατάματα και μου είχε πει, δύο φορές, ότι ποτέ της δεν διάβαζε τα αρχεία πίσω της.</w:t>
       </w:r>
     </w:p>
     <w:p/>
@@ -4447,7 +4447,7 @@
     <w:p/>
     <w:p>
       <w:r>
-        <w:t xml:space="preserve">Ο Θίο είχε την κλοπή. Την είχε βρει στα γράμματα των Μπλάκμπερν, την καρφίτσα, την πέτρα, το ενεχυροδανειστήριο. Την είχε καταλογογραφήσει με το προσεκτικό του χέρι, το ζαφείρι στην καρδιά της, και μετά είχε τραβήξει αυτά τα γράμματα από τα αρχεία και τα είχε δηλώσει χαμένα. Αλλά ο Θίο, που πνιγόταν, παρακολουθούμενος από ολόκληρη την πόλη, ποτέ στο σπίτι του, δεν θα μπορούσε να είχε κάνει τα υπόλοιπα. Δεν θα μπορούσε να είχε επιβεβαιώσει ότι το πανδοχείο είχε αγοραστεί με τα χρήματα, επειδή αυτή η απόδειξη δεν βρισκόταν στο κτίριό του. Και δεν θα μπορούσε να είχε μεταφέρει τα σημειώματα πέρα ως πέρα στην πόλη και να είχε αφήσει το ένα σε ένα γεμάτο κόσμο γραφείο εν μέσω φωτός μέρας του φεστιβάλ, επειδή ο Θίο Χουσείν δεν μπορούσε να κατεβεί τη Λεωφόρο Έβεργκριν απαρατήρητος ούτε για να σώσει τη ζωή του.</w:t>
+        <w:t xml:space="preserve">Ο Θίο είχε το μυστικό της κλοπής. Το είχε βρει στα γράμματα των Μπλάκμπερν, την καρφίτσα, την πέτρα, το ενεχυροδανειστήριο. Το είχε καταλογογραφήσει με το προσεκτικό του χέρι, το ζαφείρι στην καρδιά της, και μετά είχε τραβήξει αυτά τα γράμματα από τα αρχεία και τα είχε δηλώσει χαμένα. Αλλά ο Θίο, που πνιγόταν, παρακολουθούμενος από ολόκληρη την πόλη, ποτέ στο σπίτι του, δεν θα μπορούσε να είχε κάνει τα υπόλοιπα. Δεν θα μπορούσε να είχε επιβεβαιώσει ότι το πανδοχείο είχε αγοραστεί με τα χρήματα, επειδή αυτή η απόδειξη δεν βρισκόταν στο κτίριό του. Και δεν θα μπορούσε να είχε μεταφέρει τα σημειώματα πέρα ως πέρα στην πόλη και να είχε αφήσει το ένα σε ένα γεμάτο κόσμο γραφείο εν μέσω φωτός μέρας του φεστιβάλ, επειδή ο Θίο Χουσείν δεν μπορούσε να κατεβεί τη Λεωφόρο Έβεργκριν απαρατήρητος ούτε για να σώσει τη ζωή του.</w:t>
       </w:r>
     </w:p>
     <w:p/>
@@ -4471,7 +4471,7 @@
     <w:p/>
     <w:p>
       <w:r>
-        <w:t>Το να βρίσκεις την αλήθεια και να αποφασίζεις τι να την κάνεις είναι δύο διαφορετικά πράγματα, είχε πει ο Νικ, στη ζεστή κουζίνα με το χέρι του πάνω από το δικό μου. Μπορείς ακόμα να διαλέξεις, μετά, πώς τελειώνει.</w:t>
+        <w:t xml:space="preserve">Το να βρίσκεις την αλήθεια και να αποφασίζεις τι να την κάνεις είναι δύο διαφορετικά πράγματα, είχε πει ο Νικ, στη ζεστή κουζίνα με το χέρι του πάνω στο δικό μου. Μπορείς ακόμα να διαλέξεις, μετά, πώς τελειώνει.</w:t>
       </w:r>
     </w:p>
     <w:p/>
@@ -4584,7 +4584,7 @@
     <w:p/>
     <w:p>
       <w:r>
-        <w:t xml:space="preserve">«Είμαι σίγουρη», είπα. «Φως, όχι σκοτάδι. Αλλά απαλά, Νικ. Με όση επιείκεια μπορεί να χωρέσει η αλήθεια. Το έγκλημα βγαίνει στην επιφάνεια για να το δουν όλοι, αλλά κανείς δεν καταστρέφεται αν δεν είναι ανάγκη. Υπάρχει τρόπος να αποδοθεί δικαιοσύνη και να παραμείνει ανθρώπινη. Πρέπει να υπάρχει. Σκοπεύω να τον βρω».</w:t>
+        <w:t xml:space="preserve">«Είμαι σίγουρη», είπα. «Φως, όχι σκοτάδι. Αλλά απαλά, Νικ. Με όση επιείκεια μπορεί να χωρέσει η αλήθεια. Το έγκλημα βγαίνει στην επιφάνεια για να το δουν όλοι, αλλά κανείς δεν καταστρέφεται αν δεν είναι ανάγκη. Υπάρχει τρόπος να αποδοθεί δικαιοσύνη που να παραμένει ζεστή. Πρέπει να υπάρχει. Σκοπεύω να τον βρω».</w:t>
       </w:r>
     </w:p>
     <w:p/>
@@ -4773,7 +4773,7 @@
     <w:p/>
     <w:p>
       <w:r>
-        <w:t>Δεν ήταν εύκολο, αυτό που έκανα στη συνέχεια. Ο Θίο δεν μου είχε φερθεί παρά μόνο με καλοσύνη, και το να τα ξετυλίγω μπροστά στα μούτρα του, βλέποντας κάθε κομμάτι να προσγειώνεται, ήταν από τα πιο δύσκολα πράγματα που είχα κάνει ποτέ. Είχα διαλέξει όμως το φως, και το φως σήμαινε να το λέω ξεκάθαρα, οπότε το είπα ξεκάθαρα. Κράτησα τη φωνή μου όσο πιο απαλή μπορούσα.</w:t>
+        <w:t xml:space="preserve">Δεν ήταν εύκολο, αυτό που έκανα στη συνέχεια. Ο Θίο δεν μου είχε φερθεί παρά μόνο με καλοσύνη, και το να τα ξετυλίγω μπροστά του, βλέποντας κάθε κομμάτι να προσγειώνεται, ήταν από τα πιο δύσκολα πράγματα που είχα κάνει ποτέ. Είχα διαλέξει όμως το φως, και το φως σήμαινε να το λέω ξεκάθαρα, οπότε το είπα ξεκάθαρα. Κράτησα τη φωνή μου όσο πιο απαλή μπορούσα.</w:t>
       </w:r>
     </w:p>
     <w:p/>
@@ -4818,7 +4818,7 @@
     <w:p/>
     <w:p>
       <w:r>
-        <w:t xml:space="preserve">Σήκωσε το κεφάλι, αξιολύπητος. </w:t>
+        <w:t xml:space="preserve">Σήκωσε το κεφάλι, συντετριμμένος. </w:t>
       </w:r>
     </w:p>
     <w:p/>
@@ -4854,7 +4854,7 @@
     <w:p/>
     <w:p>
       <w:r>
-        <w:t xml:space="preserve">«Βέρα», είπα. «Ο Θίο είχε την κλοπή. Αλλά τα σημειώματα ήξεραν ότι το πανδοχείο είχε αγοραστεί με τα λεφτά από την καρφίτσα, και αυτό δεν υπήρχε ποτέ σε κανένα γράμμα των Μπλάκμπερν. Αυτό είναι αρχείο ιδιοκτησίας. Ένα συμβόλαιο. Και το συμβόλαιο αυτού του πανδοχείου καθόταν έξω από το συρτάρι του στο καλάθι επαναρχειοθέτησής σας χθες το πρωί, πιασμένο, στο γραφείο μιας γυναίκας που μου είχε πει δύο φορές ότι ποτέ δεν διαβάζει τα αρχεία που έχει πίσω της».</w:t>
+        <w:t xml:space="preserve">«Βέρα», είπα. «Ο Θίο είχε το μυστικό της κλοπής. Αλλά τα σημειώματα ήξεραν ότι το πανδοχείο είχε αγοραστεί με τα λεφτά από την καρφίτσα, και αυτό δεν υπήρχε ποτέ σε κανένα γράμμα των Μπλάκμπερν. Αυτό είναι αρχείο ιδιοκτησίας. Ένα συμβόλαιο. Και το συμβόλαιο αυτού του πανδοχείου καθόταν έξω από το συρτάρι του στο καλάθι επαναρχειοθέτησής σας χθες το πρωί, πιασμένο, στο γραφείο μιας γυναίκας που μου είχε πει δύο φορές ότι ποτέ δεν διαβάζει τα αρχεία που έχει πίσω της».</w:t>
       </w:r>
     </w:p>
     <w:p/>
@@ -4866,7 +4866,7 @@
     <w:p/>
     <w:p>
       <w:r>
-        <w:t xml:space="preserve">«Εκείνος είχε την κλοπή. Εσείς είχατε το συμβόλαιο. Και εσείς είχατε τα πόδια, Βέρα. Εκείνος δεν μπορούσε να διασχίσει αυτή την πόλη απαρατήρητος ούτε για να σώσει τη ζωή του, όλοι ξέρουν τον Θίο, όλοι τον σταματούν. Αλλά κανείς δεν ανοιγοκλείνει τα μάτια του όταν η γραμματέας του δημάρχου περνάει από το πανδοχείο κατά τη διάρκεια του φεστιβάλ. Σας προσπέρασα στα σκαλιά η ίδια εκείνο το πρωί, με τα δελτία στάθμευσης. Δεν θα μπορούσε να το είχε κάνει μόνος του. Χρειαζόταν κάποιον που μπορούσε να κινηθεί μέσα στην πόλη αόρατος. Αυτή ήσασταν εσείς».</w:t>
+        <w:t xml:space="preserve">«Εκείνος είχε το μυστικό της κλοπής. Εσείς είχατε το συμβόλαιο. Και εσείς είχατε τα πόδια, Βέρα. Εκείνος δεν μπορούσε να διασχίσει αυτή την πόλη απαρατήρητος ούτε για να σώσει τη ζωή του, όλοι ξέρουν τον Θίο, όλοι τον σταματούν. Αλλά κανείς δεν ανοιγοκλείνει τα μάτια του όταν η γραμματέας του δημάρχου περνάει από το πανδοχείο κατά τη διάρκεια του φεστιβάλ. Σας προσπέρασα στα σκαλιά η ίδια εκείνο το πρωί, με τα δελτία στάθμευσης. Δεν θα μπορούσε να το είχε κάνει μόνος του. Χρειαζόταν κάποιον που μπορούσε να κινηθεί μέσα στην πόλη αόρατος. Αυτή ήσασταν εσείς».</w:t>
       </w:r>
     </w:p>
     <w:p/>
@@ -4914,7 +4914,7 @@
     <w:p/>
     <w:p>
       <w:r>
-        <w:t xml:space="preserve">Η Νόρικο σηκώθηκε από την καρέκλα της με το σημειωματάριο στο χέρι. Η φωνή της όταν μίλησε ήταν σταθερή, και όχι αγενής.</w:t>
+        <w:t xml:space="preserve">Η Νόρικο σηκώθηκε από την καρέκλα της με το σημειωματάριο στο χέρι. Η φωνή της όταν μίλησε ήταν σταθερή, και όχι σκληρή.</w:t>
       </w:r>
     </w:p>
     <w:p/>
@@ -4949,7 +4949,7 @@
         <w:t xml:space="preserve"/>
       </w:r>
       <w:r>
-        <w:t xml:space="preserve"> είχαν επιχειρήσει να εκβιάσουν έναν τρίτο για μισό εκατομμύριο δολάρια.</w:t>
+        <w:t xml:space="preserve"> είχαν επιχειρήσει να εκβιάσουν μια τρίτη για μισό εκατομμύριο δολάρια.</w:t>
       </w:r>
     </w:p>
     <w:p/>
@@ -5133,7 +5133,7 @@
     </w:p>
     <w:p>
       <w:r>
-        <w:t xml:space="preserve">Δεν φαινόταν για νίκη, καθώς περπατούσα προς το σπίτι. Μόλις είχα πείσει έναν καλό άνθρωπο να μη διορθώσει το μοναδικό συγκεκριμένο πρόβλημα που βρισκόταν στη ρίζα όλης αυτής της θλιβερής ιστορίας, και υπήρξαν μερικά κρύα τετράγωνα σε αυτόν τον περίπατο όπου αναρωτήθηκα αν είχα φανεί σοφή ή απλώς πεισματάρα, αν είχα αφήσει ένα αληθινό καλό να πάει χαμένο για χάρη μιας αρχής που δεν θα κρατούσε ούτε μια σταγόνα βροχής έξω από το πίσω δωμάτιο.</w:t>
+        <w:t xml:space="preserve">Δεν φαινόταν για νίκη, καθώς περπατούσα προς το σπίτι. Μόλις είχα πείσει έναν καλό άνθρωπο να μη διορθώσει το μοναδικό συγκεκριμένο πρόβλημα που βρισκόταν στη ρίζα όλης αυτής της θλιβερής ιστορίας, και υπήρξαν μερικά κρύα τετράγωνα σε αυτόν τον περίπατο όπου αναρωτήθηκα αν είχα σταθεί σοφή ή απλώς πεισματάρα, αν είχα αφήσει ένα αληθινό καλό να πάει χαμένο για χάρη μιας αρχής που δεν θα κρατούσε ούτε μια σταγόνα βροχής έξω από το πίσω δωμάτιο.</w:t>
       </w:r>
     </w:p>
     <w:p>
@@ -5206,7 +5206,7 @@
     <w:p/>
     <w:p>
       <w:r>
-        <w:t xml:space="preserve">Η Κλερ το έγραψε με καλοσύνη, επειδή η Κλερ ήταν καλόκαρδη, και επειδή η αλήθεια αποδείχθηκε καλόκαρδη μόλις την έλεγες ολόκληρη αντί για το χειρότερο μισό της. Το άρθρο δημοσιεύτηκε μια Πέμπτη, ολόκληρη η πρώτη σελίδα του εσωτερικού φύλλου. Φυσικά ο κόσμος μιλούσε. Θα μιλούσαν για τον καιρό αν δεν υπήρχε τίποτα άλλο να γίνει. Αλλά δεν μιλούσαν όπως η Φιόνα περνούσε όλη της τη ζωή φοβούμενη ότι θα μιλήσουν. Κανείς δεν τραβήχτηκε πίσω. Κανείς δεν την κοίταξε στραβά πάνω από τον πάγκο του φούρνου. Σχεδόν όλοι το ενσωμάτωσαν σε όσα ήξεραν για τους δικούς τους ανθρώπους, οι οποίοι είχαν παλέψει, σφάλει και αντέξει. Οι μισοί είχαν μια προγιαγιά που είχε κάνει κάτι ήσυχο και απεγνωσμένο σε έναν δύσκολο χειμώνα κάποτε.</w:t>
+        <w:t xml:space="preserve">Η Κλερ το έγραψε με καλοσύνη, επειδή η Κλερ ήταν καλόκαρδη, και επειδή η αλήθεια αποδείχθηκε καλόκαρδη μόλις την έλεγες ολόκληρη αντί για το χειρότερο μισό της. Το άρθρο δημοσιεύτηκε μια Πέμπτη, ολόκληρη η πρώτη σελίδα του εσωτερικού φύλλου. Φυσικά ο κόσμος μιλούσε. Θα μιλούσαν για τον καιρό αν δεν υπήρχε τίποτα άλλο να γίνει. Αλλά δεν μιλούσαν όπως η Φιόνα είχε περάσει όλη της τη ζωή φοβούμενη ότι θα μιλήσουν. Κανείς δεν τραβήχτηκε πίσω. Κανείς δεν την κοίταξε στραβά πάνω από τον πάγκο του φούρνου. Σχεδόν όλοι το ενσωμάτωσαν σε όσα ήξεραν για τους δικούς τους ανθρώπους, οι οποίοι είχαν παλέψει, σφάλει και αντέξει. Οι μισοί είχαν μια προγιαγιά που είχε κάνει κάτι ήσυχο και απεγνωσμένο σε έναν δύσκολο χειμώνα κάποτε.</w:t>
       </w:r>
     </w:p>
     <w:p/>
@@ -5218,7 +5218,7 @@
     <w:p/>
     <w:p>
       <w:r>
-        <w:t xml:space="preserve">«Η Κόνστανς Οκαφόρ έκλεψε για να προσπαθήσει να σώσει τη μητέρα της», είπε, «και έφτιαξε ένα σπίτι που ζεσταίνει αυτή την πόλη εδώ και εκατό χρόνια από τότε. Αν κάποιος στο Φροστ Φολς θέλει να της πετάξει την πρώτη πέτρα για μια καρφίτσα, ας έρθει να την πετάξει πρώτα σε μένα, επειδή γνώριζα τέτοια πείνα όταν ήμουν κορίτσι, αληθινή πείνα, και το ίδιο και οι μισές γιαγιάδες των ανθρώπων που κάθονται σε αυτό το μαγαζί. Αφήστε την να αναπαυθεί. Αφήστε τη Φιόνα να σταθεί ίσια. Είναι μια καλή ιστορία. Απλώς έχει ένα δύσκολο κομμάτι στη μέση».</w:t>
+        <w:t xml:space="preserve">«Η Κόνστανς Οκαφόρ έκλεψε για να προσπαθήσει να σώσει τη μητέρα της», είπε, «και έφτιαξε ένα σπίτι που ζεσταίνει αυτή την πόλη εδώ και εκατό χρόνια από τότε. Αν κάποιος στο Φροστ Φολς θέλει να της πετάξει την πρώτη πέτρα για μια καρφίτσα, ας έρθει να την πετάξει πρώτα σε μένα, επειδή γνώριζα τέτοια στέρηση όταν ήμουν κορίτσι, αληθινή στέρηση, και το ίδιο και οι μισές γιαγιάδες των ανθρώπων που κάθονται σε αυτό το μαγαζί. Αφήστε την να αναπαυθεί. Αφήστε τη Φιόνα να σταθεί ίσια. Είναι μια καλή ιστορία. Απλώς έχει ένα δύσκολο κομμάτι στη μέση».</w:t>
       </w:r>
     </w:p>
     <w:p/>
@@ -5248,7 +5248,7 @@
     <w:p/>
     <w:p>
       <w:r>
-        <w:t xml:space="preserve">Και η Μάρθα. Η Μάρθα με άρπαξε από το χέρι στον κύκλο ένα γκρίζο απόγευμα, το κράτησε και είπε: «Θυμάσαι, πριν από λίγο καιρό, που σου είπα ότι δεν χρειαζόταν να κουβαλάς τα πράγματα μόνη σου; Ότι ένας κύκλος είναι για να στηρίζεσαι;» Είπα ότι το θυμόμουν καλά. «Λοιπόν», είπε, «πήγες και απέδειξες ότι είσαι μία από εμάς, κουβαλώντας το έτσι όπως το έκανες. Δεν στηρίχτηκες απλώς στον κύκλο όταν τον χρειάστηκες. Ήσουν ο κύκλος, για τη Φιόνα, όταν δεν είχε κανέναν άλλον. Μια ξένη δεν το κάνει αυτό, Τζέσικα. Κάποιος δικός μας το κάνει». Και μου χτύπησε το χέρι μια φορά και επέστρεψε αμέσως στο γάντι της, σαν να μη με είχε μόλις διαλύσει εντελώς εκεί που καθόμουν.</w:t>
+        <w:t xml:space="preserve">Και η Μάρθα. Η Μάρθα με άρπαξε από το χέρι στον κύκλο ένα γκρίζο απόγευμα, το κράτησε και είπε: «Θυμάσαι, πριν από λίγο καιρό, που σου είπα ότι δεν χρειαζόταν να κουβαλάς τα πράγματα μόνη σου; Ότι ένας κύκλος είναι για να στηρίζεσαι;» Είπα ότι το θυμόμουν καλά. «Λοιπόν», είπε, «πήγες και απέδειξες ότι είσαι μία από εμάς, κουβαλώντας το έτσι όπως το έκανες. Δεν στηρίχτηκες απλώς στον κύκλο όταν τον χρειάστηκες. Ήσουν ο κύκλος, για τη Φιόνα, όταν δεν είχε κανέναν άλλον. Μια ξένη δεν το κάνει αυτό, Τζέσικα. Μία δική μας το κάνει». Και μου χτύπησε το χέρι μια φορά και επέστρεψε αμέσως στο γάντι της, σαν να μη με είχε μόλις διαλύσει εντελώς εκεί που καθόμουν.</w:t>
       </w:r>
     </w:p>
     <w:p/>
@@ -5260,7 +5260,7 @@
     <w:p/>
     <w:p>
       <w:r>
-        <w:t xml:space="preserve">Περπάτησα σπίτι εκείνο το απόγευμα μέσα από μια πόλη που ένιωθα εντελώς και αναμφισβήτητα δική μου. Το φεστιβάλ είχε τελειώσει και φύγει, αλλά τα φώτα κατά μήκος της Λεωφόρου Έβεργκριν, σχεδόν όλα χρυσά πια, έφεγγαν ακόμα σταθερά ενάντια στο πρώιμο σκοτάδι. Η Πιπ περπατούσε κουνιστή μπροστά μου από τη μια λίμνη χρυσού φωτός στην άλλη, σταματώντας σε καθεμιά σαν να μπορούσε να έχει κάτι γυαλιστερό στον πάτο του.</w:t>
+        <w:t xml:space="preserve">Περπάτησα σπίτι εκείνο το απόγευμα μέσα από μια πόλη που ένιωθα εντελώς και αναμφισβήτητα δική μου. Το φεστιβάλ είχε τελειώσει και φύγει, αλλά τα φώτα κατά μήκος της Λεωφόρου Έβεργκριν, σχεδόν όλα χρυσά πια, έφεγγαν ακόμα σταθερά ενάντια στο πρώιμο σκοτάδι. Η Πιπ περπατούσε κουνιστή μπροστά μου από τη μια λίμνη χρυσού φωτός στην άλλη, σταματώντας σε καθεμιά σαν να μπορούσε να έχει κάτι γυαλιστερό στον πάτο της.</w:t>
       </w:r>
     </w:p>
     <w:p>
@@ -5349,7 +5349,7 @@
     <w:p/>
     <w:p>
       <w:r>
-        <w:t>Καθώς το κουτί αναδυόταν από τη γη, η παγωνιά άπλωσε τα νύχια της κατά μήκος των χαμηλότερων κλαδιών της φτελιάς, ακριβώς πάνω από το κεφάλι του Σαμ, λευκή και λεπτή σαν δαντέλα. Κανείς άλλος δεν κοίταξε ψηλά. Όλοι κοιτούσαν το κουτί. Ο Νικ, δίπλα μου, κοίταξε ψηλά, και μετά σε μένα, και δεν είπε τίποτα.</w:t>
+        <w:t xml:space="preserve">Καθώς το κουτί αναδυόταν από τη γη, η πάχνη απλώθηκε κατά μήκος των χαμηλότερων κλαδιών της φτελιάς, ακριβώς πάνω από το κεφάλι του Σαμ, λευκή και λεπτή σαν δαντέλα. Κανείς άλλος δεν κοίταξε ψηλά. Όλοι κοιτούσαν το κουτί. Ο Νικ, δίπλα μου, κοίταξε ψηλά, και μετά σε μένα, και δεν είπε τίποτα.</w:t>
       </w:r>
     </w:p>
     <w:p/>
@@ -5414,13 +5414,13 @@
     <w:p/>
     <w:p>
       <w:r>
-        <w:t>Ο Μαρκ συναντήθηκε με το βλέμμα μου πάνω από το κεφάλι της κόρης του. Υπήρχε ακόμα ένας πόνος σε αυτό το βλέμμα, αλλά είχε λειάνει, σαν πέτρα στο ποτάμι.</w:t>
-      </w:r>
-    </w:p>
-    <w:p/>
-    <w:p>
-      <w:r>
-        <w:t xml:space="preserve">«Θα είναι ανυπόφορη μέχρι τη νέα χρονιά», είπε. «Θέλει να ανοίξει. Ρωτάει κάθε πρωί αν είναι η νέα χρονιά ακόμα».</w:t>
+        <w:t xml:space="preserve">Ο Μαρκ έπιασε το βλέμμα μου πάνω από το κεφάλι της κόρης του. Υπήρχε ακόμα ένας πόνος σε αυτό το βλέμμα, αλλά είχε λειάνει, σαν πέτρα στο ποτάμι.</w:t>
+      </w:r>
+    </w:p>
+    <w:p/>
+    <w:p>
+      <w:r>
+        <w:t xml:space="preserve">«Θα είναι ανυπόφορη μέχρι τη νέα χρονιά», είπε. «Θέλει να το ανοίξουν. Ρωτάει κάθε πρωί αν είναι η νέα χρονιά ακόμα».</w:t>
       </w:r>
     </w:p>
     <w:p/>
@@ -5819,13 +5819,13 @@
     <w:p/>
     <w:p>
       <w:r>
-        <w:t xml:space="preserve">Ήμασταν όλες εκεί εκείνο το πρωινό. Ολόκληρος ο κύκλος, όταν καμία δεν ήταν κλινήρης με κρυολόγημα ή δεν πρόσεχε εγγόνια. Η Ολίβια στην κεφαλή του στο μαγαζί της, κουβάρια μαλλιού στοιβαγμένα πίσω της σε κάθε χρώμα που θα μπορούσε να θέλει ένας χειμώνας. Η Ντοτ δίπλα της, απλή και γρήγορη. Μετά η Κλερ Μπένετ, που έγραφε για τη Gazette, με ένα σημειωματάριο ανοιχτό στο μπράτσο της καρέκλας της επειδή η Κλερ δεν ήταν ποτέ εντελώς εκτός καθήκοντος. Έβαζε κάτω το στεφάνι της συνεχώς για να σημειώσει μια γραμμή και το ξαναέπιανε έναν χτύπο πίσω από τις υπόλοιπες. Η Άιβι δίπλα, της οποίας το γέλιο ήταν τόσο μεγάλο και τόσο πρόθυμο που το μαγαζί φαινόταν πιο φωτεινό επειδή την είχε μέσα του. Είχε καταφέρει με κάποιον τρόπο να κολλήσει έλατο στα μαλλιά της χωρίς να το προσέξει. Η Μάρθα, η συνταξιούχος δασκάλα, χήρα ούτε έναν χρόνο, με το μικρό λευκό σκυλάκι της, τον Σνόουμπολ, κοιμισμένο δίπλα στον αστράγαλό της. Το χέρι της έπεφτε προς τα κάτω κάθε τόσο για να αγγίξει το αυτί του. Για να είναι σίγουρη ότι ήταν ακόμα εκεί. Και η Έλι, ευγενική και αβίαστη, που είχε αυξήσει την εθελοντική της εργασία στο νοσοκομείο σε τρεις μέρες την εβδομάδα. Έφερνε την ίδια σταθερή τρυφερότητα σε έναν συρμάτινο σκελετό. Το στεφάνι της έβγαινε να μοιάζει λιγότερο φτιαγμένο και περισσότερο φυσικά μεγαλωμένο.</w:t>
-      </w:r>
-    </w:p>
-    <w:p/>
-    <w:p>
-      <w:r>
-        <w:t xml:space="preserve">Και η Πιπ, η οποία δεν ήταν μέλος του κύκλου αλλά θα προσβαλλόταν βαριά αν έμενε εκτός από οποιαδήποτε μέτρηση του ποιος ήταν παρών. Είχε εγκατασταθεί κάτω από το μπροστινό παράθυρο στη μοναδική λωρίδα χαμηλού ηλιακού φωτός του Νοεμβρίου, σε μια φωλιά που είχε χτίσει από ένα πεσμένο κουβάρι κόκκινου μαλλιού που η Ολίβια, όπως παρατήρησα, δεν είχε προσπαθήσει πολύ σκληρά να πάρει πίσω. Ήταν ξαπλωμένη εκεί λαμπερή και ικανοποιημένη, με το ένα μάτι μισάνοιχτο στις διαδικασίες και σε ό,τι γυάλιζε. Και υπήρχε αρκετό υλικό που γυάλιζε. Η Ολίβια είχε ένα βάζο με επιχρυσωμένα κουκουνάρια στο τραπέζι, ένα καρούλι χρυσής κορδέλας δίπλα του. Η Πιπ είχε ήδη δεχτεί παρατηρήσεις και για τα δύο. Δύο φορές.</w:t>
+        <w:t xml:space="preserve">Ήμασταν όλες εκεί εκείνο το πρωινό. Ολόκληρος ο κύκλος, όταν καμία δεν ήταν κλινήρης με κρυολόγημα ή δεν πρόσεχε εγγόνια. Η Ολίβια στην κεφαλή του στο μαγαζί της, κουβάρια μαλλιού στοιβαγμένα πίσω της σε κάθε χρώμα που θα μπορούσε να θέλει ένας χειμώνας. Η Ντοτ δίπλα της, απλή και γρήγορη. Μετά η Κλερ Μπένετ, που έγραφε για τη Gazette, με ένα σημειωματάριο ανοιχτό στο μπράτσο της καρέκλας της επειδή η Κλερ δεν ήταν ποτέ εντελώς εκτός καθήκοντος. Έβαζε κάτω το στεφάνι της συνεχώς για να σημειώσει μια γραμμή και το ξαναέπιανε έναν χτύπο πίσω από τις υπόλοιπες. Η Άιβι δίπλα, της οποίας το γέλιο ήταν τόσο μεγάλο και τόσο πρόθυμο που το μαγαζί φαινόταν πιο φωτεινό επειδή την είχε μέσα του. Είχε καταφέρει με κάποιον τρόπο να κολλήσει έλατο στα μαλλιά της χωρίς να το προσέξει. Η Μάρθα, η συνταξιούχος δασκάλα, χήρα εδώ και πολλά χρόνια, με το μικρό λευκό σκυλάκι της, τον Σνόουμπολ, κοιμισμένο δίπλα στον αστράγαλό της. Το χέρι της έπεφτε προς τα κάτω κάθε τόσο για να αγγίξει το αυτί του. Για να είναι σίγουρη ότι ήταν ακόμα εκεί. Και η Έλι, ευγενική και αβίαστη, που έκανε εθελοντική εργασία στο νοσοκομείο τρεις μέρες την εβδομάδα. Έφερνε την ίδια σταθερή τρυφερότητα σε έναν συρμάτινο σκελετό. Το στεφάνι της έβγαινε να μοιάζει λιγότερο φτιαγμένο και περισσότερο φυσικά μεγαλωμένο.</w:t>
+      </w:r>
+    </w:p>
+    <w:p/>
+    <w:p>
+      <w:r>
+        <w:t xml:space="preserve">Και η Πιπ, η οποία δεν ήταν μέλος του κύκλου αλλά θα προσβαλλόταν βαριά αν έμενε εκτός από οποιαδήποτε μέτρηση του ποιος ήταν παρών. Είχε εγκατασταθεί κάτω από το μπροστινό παράθυρο στη μοναδική λωρίδα χαμηλού ηλιακού φωτός του Νοεμβρίου, σε μια φωλιά που είχε χτίσει από ένα πεσμένο κουβάρι κόκκινου μαλλιού που η Ολίβια, όπως παρατήρησα, δεν είχε προσπαθήσει πολύ σκληρά να πάρει πίσω. Ήταν ξαπλωμένη εκεί λαμπερή και ικανοποιημένη, με το ένα μάτι μισάνοιχτο στις διαδικασίες. Σε ό,τι γυάλιζε, κυρίως. Και υπήρχε αρκετό υλικό που γυάλιζε. Η Ολίβια είχε ένα βάζο με επιχρυσωμένα κουκουνάρια στο τραπέζι, ένα καρούλι χρυσής κορδέλας δίπλα του. Η Πιπ είχε ήδη δεχτεί παρατηρήσεις και για τα δύο. Δύο φορές.</w:t>
       </w:r>
     </w:p>
     <w:p/>

</xml_diff>